<commit_message>
Można pobrać załączniki 9,1,2,2a,3,6 po ich ukończeniu
</commit_message>
<xml_diff>
--- a/Projekt/app/docs/Zal_2a.docx
+++ b/Projekt/app/docs/Zal_2a.docx
@@ -1,6 +1,6 @@
 
 <file path=word/document.xml><?xml version="1.0" encoding="utf-8"?>
-<w:document xmlns:wpc="http://schemas.microsoft.com/office/word/2010/wordprocessingCanvas" xmlns:cx="http://schemas.microsoft.com/office/drawing/2014/chartex" xmlns:cx1="http://schemas.microsoft.com/office/drawing/2015/9/8/chartex" xmlns:cx2="http://schemas.microsoft.com/office/drawing/2015/10/21/chartex" xmlns:cx3="http://schemas.microsoft.com/office/drawing/2016/5/9/chartex" xmlns:cx4="http://schemas.microsoft.com/office/drawing/2016/5/10/chartex" xmlns:cx5="http://schemas.microsoft.com/office/drawing/2016/5/11/chartex" xmlns:cx6="http://schemas.microsoft.com/office/drawing/2016/5/12/chartex" xmlns:cx7="http://schemas.microsoft.com/office/drawing/2016/5/13/chartex" xmlns:cx8="http://schemas.microsoft.com/office/drawing/2016/5/14/chartex" xmlns:mc="http://schemas.openxmlformats.org/markup-compatibility/2006" xmlns:aink="http://schemas.microsoft.com/office/drawing/2016/ink" xmlns:am3d="http://schemas.microsoft.com/office/drawing/2017/model3d" xmlns:o="urn:schemas-microsoft-com:office:office" xmlns:oel="http://schemas.microsoft.com/office/2019/extlst" xmlns:r="http://schemas.openxmlformats.org/officeDocument/2006/relationships" xmlns:m="http://schemas.openxmlformats.org/officeDocument/2006/math" xmlns:v="urn:schemas-microsoft-com:vml" xmlns:wp14="http://schemas.microsoft.com/office/word/2010/wordprocessingDrawing" xmlns:wp="http://schemas.openxmlformats.org/drawingml/2006/wordprocessingDrawing" xmlns:w10="urn:schemas-microsoft-com:office:word" xmlns:w="http://schemas.openxmlformats.org/wordprocessingml/2006/main" xmlns:w14="http://schemas.microsoft.com/office/word/2010/wordml" xmlns:w15="http://schemas.microsoft.com/office/word/2012/wordml" xmlns:w16cex="http://schemas.microsoft.com/office/word/2018/wordml/cex" xmlns:w16cid="http://schemas.microsoft.com/office/word/2016/wordml/cid" xmlns:w16="http://schemas.microsoft.com/office/word/2018/wordml" xmlns:w16du="http://schemas.microsoft.com/office/word/2023/wordml/word16du" xmlns:w16sdtdh="http://schemas.microsoft.com/office/word/2020/wordml/sdtdatahash" xmlns:w16se="http://schemas.microsoft.com/office/word/2015/wordml/symex" xmlns:wpg="http://schemas.microsoft.com/office/word/2010/wordprocessingGroup" xmlns:wpi="http://schemas.microsoft.com/office/word/2010/wordprocessingInk" xmlns:wne="http://schemas.microsoft.com/office/word/2006/wordml" xmlns:wps="http://schemas.microsoft.com/office/word/2010/wordprocessingShape" mc:Ignorable="w14 w15 w16se w16cid w16 w16cex w16sdtdh w16du wp14">
+<w:document xmlns:wpc="http://schemas.microsoft.com/office/word/2010/wordprocessingCanvas" xmlns:cx="http://schemas.microsoft.com/office/drawing/2014/chartex" xmlns:cx1="http://schemas.microsoft.com/office/drawing/2015/9/8/chartex" xmlns:cx2="http://schemas.microsoft.com/office/drawing/2015/10/21/chartex" xmlns:cx3="http://schemas.microsoft.com/office/drawing/2016/5/9/chartex" xmlns:cx4="http://schemas.microsoft.com/office/drawing/2016/5/10/chartex" xmlns:cx5="http://schemas.microsoft.com/office/drawing/2016/5/11/chartex" xmlns:cx6="http://schemas.microsoft.com/office/drawing/2016/5/12/chartex" xmlns:cx7="http://schemas.microsoft.com/office/drawing/2016/5/13/chartex" xmlns:cx8="http://schemas.microsoft.com/office/drawing/2016/5/14/chartex" xmlns:mc="http://schemas.openxmlformats.org/markup-compatibility/2006" xmlns:aink="http://schemas.microsoft.com/office/drawing/2016/ink" xmlns:am3d="http://schemas.microsoft.com/office/drawing/2017/model3d" xmlns:o="urn:schemas-microsoft-com:office:office" xmlns:oel="http://schemas.microsoft.com/office/2019/extlst" xmlns:r="http://schemas.openxmlformats.org/officeDocument/2006/relationships" xmlns:m="http://schemas.openxmlformats.org/officeDocument/2006/math" xmlns:v="urn:schemas-microsoft-com:vml" xmlns:wp14="http://schemas.microsoft.com/office/word/2010/wordprocessingDrawing" xmlns:wp="http://schemas.openxmlformats.org/drawingml/2006/wordprocessingDrawing" xmlns:w10="urn:schemas-microsoft-com:office:word" xmlns:w="http://schemas.openxmlformats.org/wordprocessingml/2006/main" xmlns:w14="http://schemas.microsoft.com/office/word/2010/wordml" xmlns:w15="http://schemas.microsoft.com/office/word/2012/wordml" xmlns:w16cex="http://schemas.microsoft.com/office/word/2018/wordml/cex" xmlns:w16cid="http://schemas.microsoft.com/office/word/2016/wordml/cid" xmlns:w16="http://schemas.microsoft.com/office/word/2018/wordml" xmlns:w16du="http://schemas.microsoft.com/office/word/2023/wordml/word16du" xmlns:w16sdtdh="http://schemas.microsoft.com/office/word/2020/wordml/sdtdatahash" xmlns:w16sdtfl="http://schemas.microsoft.com/office/word/2024/wordml/sdtformatlock" xmlns:w16se="http://schemas.microsoft.com/office/word/2015/wordml/symex" xmlns:wpg="http://schemas.microsoft.com/office/word/2010/wordprocessingGroup" xmlns:wpi="http://schemas.microsoft.com/office/word/2010/wordprocessingInk" xmlns:wne="http://schemas.microsoft.com/office/word/2006/wordml" xmlns:wps="http://schemas.microsoft.com/office/word/2010/wordprocessingShape" mc:Ignorable="w14 w15 w16se w16cid w16 w16cex w16sdtdh w16sdtfl w16du wp14">
   <w:body>
     <w:p>
       <w:pPr>
@@ -134,28 +134,24 @@
         <w:rPr>
           <w:rFonts w:ascii="Cambria" w:hAnsi="Cambria" w:cs="Calibri"/>
           <w:sz w:val="22"/>
+          <w:szCs w:val="22"/>
         </w:rPr>
       </w:pPr>
       <w:r>
         <w:rPr>
           <w:rFonts w:ascii="Cambria" w:hAnsi="Cambria" w:cs="Calibri"/>
           <w:sz w:val="22"/>
-        </w:rPr>
-        <w:t>Student / ka: .........................................................</w:t>
+          <w:szCs w:val="22"/>
+        </w:rPr>
+        <w:t xml:space="preserve">Student / ka: </w:t>
       </w:r>
       <w:r>
         <w:rPr>
           <w:rFonts w:ascii="Cambria" w:hAnsi="Cambria" w:cs="Calibri"/>
           <w:sz w:val="22"/>
-        </w:rPr>
-        <w:t>............................................................</w:t>
-      </w:r>
-      <w:r>
-        <w:rPr>
-          <w:rFonts w:ascii="Cambria" w:hAnsi="Cambria" w:cs="Calibri"/>
-          <w:sz w:val="22"/>
-        </w:rPr>
-        <w:t>..............................................</w:t>
+          <w:szCs w:val="22"/>
+        </w:rPr>
+        <w:t>{{ student.imie }} {{ student.nazwisko }}</w:t>
       </w:r>
     </w:p>
     <w:p>
@@ -166,7 +162,6 @@
         <w:jc w:val="both"/>
         <w:rPr>
           <w:rFonts w:ascii="Cambria" w:hAnsi="Cambria" w:cs="Calibri"/>
-          <w:sz w:val="22"/>
         </w:rPr>
       </w:pPr>
       <w:r>
@@ -174,7 +169,23 @@
           <w:rFonts w:ascii="Cambria" w:hAnsi="Cambria" w:cs="Calibri"/>
           <w:sz w:val="22"/>
         </w:rPr>
-        <w:t>Nr albumu .....................................</w:t>
+        <w:t xml:space="preserve">Nr </w:t>
+      </w:r>
+      <w:r>
+        <w:rPr>
+          <w:rFonts w:ascii="Cambria" w:hAnsi="Cambria" w:cs="Calibri"/>
+          <w:sz w:val="22"/>
+          <w:szCs w:val="22"/>
+        </w:rPr>
+        <w:t xml:space="preserve">albumu </w:t>
+      </w:r>
+      <w:r>
+        <w:rPr>
+          <w:rFonts w:ascii="Cambria" w:hAnsi="Cambria" w:cs="Calibri"/>
+          <w:sz w:val="22"/>
+          <w:szCs w:val="22"/>
+        </w:rPr>
+        <w:t>{{ student.numer_albumu }}</w:t>
       </w:r>
     </w:p>
     <w:p>
@@ -216,28 +227,24 @@
         <w:rPr>
           <w:rFonts w:ascii="Cambria" w:hAnsi="Cambria" w:cs="Calibri"/>
           <w:sz w:val="22"/>
+          <w:szCs w:val="22"/>
         </w:rPr>
       </w:pPr>
       <w:r>
         <w:rPr>
           <w:rFonts w:ascii="Cambria" w:hAnsi="Cambria" w:cs="Calibri"/>
           <w:sz w:val="22"/>
-        </w:rPr>
-        <w:t>Specjalność: .............................</w:t>
+          <w:szCs w:val="22"/>
+        </w:rPr>
+        <w:t xml:space="preserve">Specjalność: </w:t>
       </w:r>
       <w:r>
         <w:rPr>
           <w:rFonts w:ascii="Cambria" w:hAnsi="Cambria" w:cs="Calibri"/>
           <w:sz w:val="22"/>
-        </w:rPr>
-        <w:t>..............................................................................</w:t>
-      </w:r>
-      <w:r>
-        <w:rPr>
-          <w:rFonts w:ascii="Cambria" w:hAnsi="Cambria" w:cs="Calibri"/>
-          <w:sz w:val="22"/>
-        </w:rPr>
-        <w:t>.........................................................</w:t>
+          <w:szCs w:val="22"/>
+        </w:rPr>
+        <w:t>{{ selected_student.specjalnosc }}</w:t>
       </w:r>
     </w:p>
     <w:p>
@@ -277,31 +284,13 @@
         <w:rPr>
           <w:rFonts w:asciiTheme="majorHAnsi" w:hAnsiTheme="majorHAnsi" w:cs="Times New Roman"/>
         </w:rPr>
-        <w:t>……………………………………………</w:t>
-      </w:r>
-      <w:r>
-        <w:rPr>
-          <w:rFonts w:asciiTheme="majorHAnsi" w:hAnsiTheme="majorHAnsi" w:cs="Times New Roman"/>
-        </w:rPr>
-        <w:t>………….</w:t>
-      </w:r>
-      <w:r>
-        <w:rPr>
-          <w:rFonts w:asciiTheme="majorHAnsi" w:hAnsiTheme="majorHAnsi" w:cs="Times New Roman"/>
-        </w:rPr>
-        <w:t>……………………………………………</w:t>
-      </w:r>
-      <w:r>
-        <w:rPr>
-          <w:rFonts w:asciiTheme="majorHAnsi" w:hAnsiTheme="majorHAnsi" w:cs="Times New Roman"/>
-        </w:rPr>
-        <w:t>………………..</w:t>
-      </w:r>
-      <w:r>
-        <w:rPr>
-          <w:rFonts w:asciiTheme="majorHAnsi" w:hAnsiTheme="majorHAnsi" w:cs="Times New Roman"/>
-        </w:rPr>
-        <w:t>…………………</w:t>
+        <w:t>{{ selected_student.firma_nazwa</w:t>
+      </w:r>
+      <w:r>
+        <w:rPr>
+          <w:rFonts w:asciiTheme="majorHAnsi" w:hAnsiTheme="majorHAnsi" w:cs="Times New Roman"/>
+        </w:rPr>
+        <w:t xml:space="preserve"> }}</w:t>
       </w:r>
     </w:p>
     <w:p>
@@ -311,56 +300,59 @@
           <w:rFonts w:asciiTheme="majorHAnsi" w:hAnsiTheme="majorHAnsi" w:cs="Times New Roman"/>
         </w:rPr>
       </w:pPr>
-    </w:p>
-    <w:p>
-      <w:pPr>
-        <w:spacing w:before="120" w:after="0" w:line="240" w:lineRule="auto"/>
-        <w:rPr>
-          <w:rFonts w:asciiTheme="majorHAnsi" w:hAnsiTheme="majorHAnsi" w:cs="Times New Roman"/>
-          <w:b/>
-        </w:rPr>
-      </w:pPr>
-      <w:r>
-        <w:rPr>
-          <w:rFonts w:asciiTheme="majorHAnsi" w:hAnsiTheme="majorHAnsi" w:cs="Times New Roman"/>
-        </w:rPr>
-        <w:t>Termin realizacji praktyki:   od …</w:t>
-      </w:r>
-      <w:r>
-        <w:rPr>
-          <w:rFonts w:asciiTheme="majorHAnsi" w:hAnsiTheme="majorHAnsi" w:cs="Times New Roman"/>
-        </w:rPr>
-        <w:t>……..</w:t>
-      </w:r>
-      <w:r>
-        <w:rPr>
-          <w:rFonts w:asciiTheme="majorHAnsi" w:hAnsiTheme="majorHAnsi" w:cs="Times New Roman"/>
-        </w:rPr>
-        <w:t>....         do ……</w:t>
-      </w:r>
-      <w:r>
-        <w:rPr>
-          <w:rFonts w:asciiTheme="majorHAnsi" w:hAnsiTheme="majorHAnsi" w:cs="Times New Roman"/>
-        </w:rPr>
-        <w:t>…….</w:t>
-      </w:r>
-      <w:r>
-        <w:rPr>
-          <w:rFonts w:asciiTheme="majorHAnsi" w:hAnsiTheme="majorHAnsi" w:cs="Times New Roman"/>
-        </w:rPr>
-        <w:t xml:space="preserve">…          </w:t>
-      </w:r>
-      <w:r>
-        <w:rPr>
-          <w:rFonts w:asciiTheme="majorHAnsi" w:hAnsiTheme="majorHAnsi" w:cs="Times New Roman"/>
-        </w:rPr>
-        <w:t xml:space="preserve">             </w:t>
-      </w:r>
-      <w:r>
-        <w:rPr>
-          <w:rFonts w:asciiTheme="majorHAnsi" w:hAnsiTheme="majorHAnsi" w:cs="Times New Roman"/>
-        </w:rPr>
-        <w:t xml:space="preserve">  </w:t>
+      <w:r>
+        <w:rPr>
+          <w:rFonts w:asciiTheme="majorHAnsi" w:hAnsiTheme="majorHAnsi" w:cs="Times New Roman"/>
+        </w:rPr>
+        <w:t xml:space="preserve">Termin realizacji praktyki:   od </w:t>
+      </w:r>
+      <w:r>
+        <w:rPr>
+          <w:rFonts w:asciiTheme="majorHAnsi" w:hAnsiTheme="majorHAnsi" w:cs="Times New Roman"/>
+        </w:rPr>
+        <w:t>{{ selected_student.termin_od</w:t>
+      </w:r>
+      <w:r>
+        <w:rPr>
+          <w:rFonts w:asciiTheme="majorHAnsi" w:hAnsiTheme="majorHAnsi" w:cs="Times New Roman"/>
+        </w:rPr>
+        <w:t xml:space="preserve"> }}</w:t>
+      </w:r>
+      <w:r>
+        <w:rPr>
+          <w:rFonts w:asciiTheme="majorHAnsi" w:hAnsiTheme="majorHAnsi" w:cs="Times New Roman"/>
+        </w:rPr>
+        <w:t xml:space="preserve">         do</w:t>
+      </w:r>
+      <w:r>
+        <w:rPr>
+          <w:rFonts w:asciiTheme="majorHAnsi" w:hAnsiTheme="majorHAnsi" w:cs="Times New Roman"/>
+        </w:rPr>
+        <w:t xml:space="preserve"> </w:t>
+      </w:r>
+      <w:r>
+        <w:rPr>
+          <w:rFonts w:asciiTheme="majorHAnsi" w:hAnsiTheme="majorHAnsi" w:cs="Times New Roman"/>
+        </w:rPr>
+        <w:t>{{ selected_student.termin_do</w:t>
+      </w:r>
+      <w:r>
+        <w:rPr>
+          <w:rFonts w:asciiTheme="majorHAnsi" w:hAnsiTheme="majorHAnsi" w:cs="Times New Roman"/>
+        </w:rPr>
+        <w:t xml:space="preserve"> }}</w:t>
+      </w:r>
+      <w:r>
+        <w:rPr>
+          <w:rFonts w:asciiTheme="majorHAnsi" w:hAnsiTheme="majorHAnsi" w:cs="Times New Roman"/>
+        </w:rPr>
+        <w:t xml:space="preserve">          </w:t>
+      </w:r>
+      <w:r>
+        <w:rPr>
+          <w:rFonts w:asciiTheme="majorHAnsi" w:hAnsiTheme="majorHAnsi" w:cs="Times New Roman"/>
+        </w:rPr>
+        <w:t xml:space="preserve">          </w:t>
       </w:r>
       <w:r>
         <w:rPr>
@@ -595,6 +587,36 @@
                 <w:rFonts w:asciiTheme="majorHAnsi" w:hAnsiTheme="majorHAnsi" w:cs="Times New Roman"/>
               </w:rPr>
             </w:pPr>
+            <w:r>
+              <w:rPr>
+                <w:rFonts w:asciiTheme="majorHAnsi" w:hAnsiTheme="majorHAnsi" w:cs="Times New Roman"/>
+              </w:rPr>
+              <w:t xml:space="preserve">{{ </w:t>
+            </w:r>
+            <w:r>
+              <w:rPr>
+                <w:rFonts w:asciiTheme="majorHAnsi" w:hAnsiTheme="majorHAnsi" w:cs="Times New Roman"/>
+              </w:rPr>
+              <w:t>program_entries[</w:t>
+            </w:r>
+            <w:r>
+              <w:rPr>
+                <w:rFonts w:asciiTheme="majorHAnsi" w:hAnsiTheme="majorHAnsi" w:cs="Times New Roman"/>
+              </w:rPr>
+              <w:t>0</w:t>
+            </w:r>
+            <w:r>
+              <w:rPr>
+                <w:rFonts w:asciiTheme="majorHAnsi" w:hAnsiTheme="majorHAnsi" w:cs="Times New Roman"/>
+              </w:rPr>
+              <w:t>].ppz</w:t>
+            </w:r>
+            <w:r>
+              <w:rPr>
+                <w:rFonts w:asciiTheme="majorHAnsi" w:hAnsiTheme="majorHAnsi" w:cs="Times New Roman"/>
+              </w:rPr>
+              <w:t xml:space="preserve"> }}</w:t>
+            </w:r>
           </w:p>
         </w:tc>
       </w:tr>
@@ -654,6 +676,36 @@
                 <w:rFonts w:asciiTheme="majorHAnsi" w:hAnsiTheme="majorHAnsi" w:cs="Times New Roman"/>
               </w:rPr>
             </w:pPr>
+            <w:r>
+              <w:rPr>
+                <w:rFonts w:asciiTheme="majorHAnsi" w:hAnsiTheme="majorHAnsi" w:cs="Times New Roman"/>
+              </w:rPr>
+              <w:t xml:space="preserve">{{ </w:t>
+            </w:r>
+            <w:r>
+              <w:rPr>
+                <w:rFonts w:asciiTheme="majorHAnsi" w:hAnsiTheme="majorHAnsi" w:cs="Times New Roman"/>
+              </w:rPr>
+              <w:t>program_entries[</w:t>
+            </w:r>
+            <w:r>
+              <w:rPr>
+                <w:rFonts w:asciiTheme="majorHAnsi" w:hAnsiTheme="majorHAnsi" w:cs="Times New Roman"/>
+              </w:rPr>
+              <w:t>1</w:t>
+            </w:r>
+            <w:r>
+              <w:rPr>
+                <w:rFonts w:asciiTheme="majorHAnsi" w:hAnsiTheme="majorHAnsi" w:cs="Times New Roman"/>
+              </w:rPr>
+              <w:t>].ppz</w:t>
+            </w:r>
+            <w:r>
+              <w:rPr>
+                <w:rFonts w:asciiTheme="majorHAnsi" w:hAnsiTheme="majorHAnsi" w:cs="Times New Roman"/>
+              </w:rPr>
+              <w:t xml:space="preserve"> }}</w:t>
+            </w:r>
           </w:p>
         </w:tc>
       </w:tr>
@@ -713,6 +765,36 @@
                 <w:rFonts w:asciiTheme="majorHAnsi" w:hAnsiTheme="majorHAnsi" w:cs="Times New Roman"/>
               </w:rPr>
             </w:pPr>
+            <w:r>
+              <w:rPr>
+                <w:rFonts w:asciiTheme="majorHAnsi" w:hAnsiTheme="majorHAnsi" w:cs="Times New Roman"/>
+              </w:rPr>
+              <w:t xml:space="preserve">{{ </w:t>
+            </w:r>
+            <w:r>
+              <w:rPr>
+                <w:rFonts w:asciiTheme="majorHAnsi" w:hAnsiTheme="majorHAnsi" w:cs="Times New Roman"/>
+              </w:rPr>
+              <w:t>program_entries[</w:t>
+            </w:r>
+            <w:r>
+              <w:rPr>
+                <w:rFonts w:asciiTheme="majorHAnsi" w:hAnsiTheme="majorHAnsi" w:cs="Times New Roman"/>
+              </w:rPr>
+              <w:t>2</w:t>
+            </w:r>
+            <w:r>
+              <w:rPr>
+                <w:rFonts w:asciiTheme="majorHAnsi" w:hAnsiTheme="majorHAnsi" w:cs="Times New Roman"/>
+              </w:rPr>
+              <w:t>].ppz</w:t>
+            </w:r>
+            <w:r>
+              <w:rPr>
+                <w:rFonts w:asciiTheme="majorHAnsi" w:hAnsiTheme="majorHAnsi" w:cs="Times New Roman"/>
+              </w:rPr>
+              <w:t xml:space="preserve"> }}</w:t>
+            </w:r>
           </w:p>
         </w:tc>
       </w:tr>
@@ -773,6 +855,36 @@
                 <w:rFonts w:asciiTheme="majorHAnsi" w:hAnsiTheme="majorHAnsi" w:cs="Times New Roman"/>
               </w:rPr>
             </w:pPr>
+            <w:r>
+              <w:rPr>
+                <w:rFonts w:asciiTheme="majorHAnsi" w:hAnsiTheme="majorHAnsi" w:cs="Times New Roman"/>
+              </w:rPr>
+              <w:t xml:space="preserve">{{ </w:t>
+            </w:r>
+            <w:r>
+              <w:rPr>
+                <w:rFonts w:asciiTheme="majorHAnsi" w:hAnsiTheme="majorHAnsi" w:cs="Times New Roman"/>
+              </w:rPr>
+              <w:t>program_entries[</w:t>
+            </w:r>
+            <w:r>
+              <w:rPr>
+                <w:rFonts w:asciiTheme="majorHAnsi" w:hAnsiTheme="majorHAnsi" w:cs="Times New Roman"/>
+              </w:rPr>
+              <w:t>3</w:t>
+            </w:r>
+            <w:r>
+              <w:rPr>
+                <w:rFonts w:asciiTheme="majorHAnsi" w:hAnsiTheme="majorHAnsi" w:cs="Times New Roman"/>
+              </w:rPr>
+              <w:t>].ppz</w:t>
+            </w:r>
+            <w:r>
+              <w:rPr>
+                <w:rFonts w:asciiTheme="majorHAnsi" w:hAnsiTheme="majorHAnsi" w:cs="Times New Roman"/>
+              </w:rPr>
+              <w:t xml:space="preserve"> }}</w:t>
+            </w:r>
           </w:p>
         </w:tc>
       </w:tr>
@@ -833,6 +945,36 @@
                 <w:rFonts w:asciiTheme="majorHAnsi" w:hAnsiTheme="majorHAnsi" w:cs="Times New Roman"/>
               </w:rPr>
             </w:pPr>
+            <w:r>
+              <w:rPr>
+                <w:rFonts w:asciiTheme="majorHAnsi" w:hAnsiTheme="majorHAnsi" w:cs="Times New Roman"/>
+              </w:rPr>
+              <w:t xml:space="preserve">{{ </w:t>
+            </w:r>
+            <w:r>
+              <w:rPr>
+                <w:rFonts w:asciiTheme="majorHAnsi" w:hAnsiTheme="majorHAnsi" w:cs="Times New Roman"/>
+              </w:rPr>
+              <w:t>program_entries[</w:t>
+            </w:r>
+            <w:r>
+              <w:rPr>
+                <w:rFonts w:asciiTheme="majorHAnsi" w:hAnsiTheme="majorHAnsi" w:cs="Times New Roman"/>
+              </w:rPr>
+              <w:t>4</w:t>
+            </w:r>
+            <w:r>
+              <w:rPr>
+                <w:rFonts w:asciiTheme="majorHAnsi" w:hAnsiTheme="majorHAnsi" w:cs="Times New Roman"/>
+              </w:rPr>
+              <w:t>].ppz</w:t>
+            </w:r>
+            <w:r>
+              <w:rPr>
+                <w:rFonts w:asciiTheme="majorHAnsi" w:hAnsiTheme="majorHAnsi" w:cs="Times New Roman"/>
+              </w:rPr>
+              <w:t xml:space="preserve"> }}</w:t>
+            </w:r>
           </w:p>
         </w:tc>
       </w:tr>
@@ -881,14 +1023,14 @@
               <w:rPr>
                 <w:rFonts w:ascii="Cambria" w:hAnsi="Cambria" w:cs="Calibri"/>
               </w:rPr>
-              <w:t xml:space="preserve">W oparciu o kontakty ze środowiskiem inżynierskim zakładu, potrafi podnieść swoje kompetencje, wiedzę i umiejętności, co najmniej z dwóch zakresów: zadania dotyczące  sprzętu i oprogramowania: np.: </w:t>
+              <w:t xml:space="preserve">W oparciu o kontakty ze środowiskiem inżynierskim zakładu, potrafi podnieść swoje kompetencje, wiedzę i umiejętności, co najmniej z dwóch zakresów: zadania dotyczące  sprzętu i oprogramowania: np.: programowania, administrowanie siecią </w:t>
             </w:r>
             <w:r>
               <w:rPr>
                 <w:rFonts w:ascii="Cambria" w:hAnsi="Cambria" w:cs="Calibri"/>
               </w:rPr>
               <w:lastRenderedPageBreak/>
-              <w:t>programowania, administrowanie siecią komputerową, konserwacja sprzętu i oprogramowania, bieżące usuwanie usterek , administrowanie zasobami informatycznymi, zakładu pracy / instytucji, (e)</w:t>
+              <w:t>komputerową, konserwacja sprzętu i oprogramowania, bieżące usuwanie usterek , administrowanie zasobami informatycznymi, zakładu pracy / instytucji, (e)</w:t>
             </w:r>
             <w:r>
               <w:rPr>
@@ -921,6 +1063,37 @@
                 <w:rFonts w:asciiTheme="majorHAnsi" w:hAnsiTheme="majorHAnsi" w:cs="Times New Roman"/>
               </w:rPr>
             </w:pPr>
+            <w:r>
+              <w:rPr>
+                <w:rFonts w:asciiTheme="majorHAnsi" w:hAnsiTheme="majorHAnsi" w:cs="Times New Roman"/>
+              </w:rPr>
+              <w:lastRenderedPageBreak/>
+              <w:t xml:space="preserve">{{ </w:t>
+            </w:r>
+            <w:r>
+              <w:rPr>
+                <w:rFonts w:asciiTheme="majorHAnsi" w:hAnsiTheme="majorHAnsi" w:cs="Times New Roman"/>
+              </w:rPr>
+              <w:t>program_entries[</w:t>
+            </w:r>
+            <w:r>
+              <w:rPr>
+                <w:rFonts w:asciiTheme="majorHAnsi" w:hAnsiTheme="majorHAnsi" w:cs="Times New Roman"/>
+              </w:rPr>
+              <w:t>5</w:t>
+            </w:r>
+            <w:r>
+              <w:rPr>
+                <w:rFonts w:asciiTheme="majorHAnsi" w:hAnsiTheme="majorHAnsi" w:cs="Times New Roman"/>
+              </w:rPr>
+              <w:t>].ppz</w:t>
+            </w:r>
+            <w:r>
+              <w:rPr>
+                <w:rFonts w:asciiTheme="majorHAnsi" w:hAnsiTheme="majorHAnsi" w:cs="Times New Roman"/>
+              </w:rPr>
+              <w:t xml:space="preserve"> }}</w:t>
+            </w:r>
           </w:p>
         </w:tc>
       </w:tr>
@@ -980,6 +1153,36 @@
                 <w:rFonts w:asciiTheme="majorHAnsi" w:hAnsiTheme="majorHAnsi" w:cs="Times New Roman"/>
               </w:rPr>
             </w:pPr>
+            <w:r>
+              <w:rPr>
+                <w:rFonts w:asciiTheme="majorHAnsi" w:hAnsiTheme="majorHAnsi" w:cs="Times New Roman"/>
+              </w:rPr>
+              <w:t xml:space="preserve">{{ </w:t>
+            </w:r>
+            <w:r>
+              <w:rPr>
+                <w:rFonts w:asciiTheme="majorHAnsi" w:hAnsiTheme="majorHAnsi" w:cs="Times New Roman"/>
+              </w:rPr>
+              <w:t>program_entries[</w:t>
+            </w:r>
+            <w:r>
+              <w:rPr>
+                <w:rFonts w:asciiTheme="majorHAnsi" w:hAnsiTheme="majorHAnsi" w:cs="Times New Roman"/>
+              </w:rPr>
+              <w:t>6</w:t>
+            </w:r>
+            <w:r>
+              <w:rPr>
+                <w:rFonts w:asciiTheme="majorHAnsi" w:hAnsiTheme="majorHAnsi" w:cs="Times New Roman"/>
+              </w:rPr>
+              <w:t>].ppz</w:t>
+            </w:r>
+            <w:r>
+              <w:rPr>
+                <w:rFonts w:asciiTheme="majorHAnsi" w:hAnsiTheme="majorHAnsi" w:cs="Times New Roman"/>
+              </w:rPr>
+              <w:t xml:space="preserve"> }}</w:t>
+            </w:r>
           </w:p>
         </w:tc>
       </w:tr>
@@ -1051,6 +1254,36 @@
                 <w:rFonts w:asciiTheme="majorHAnsi" w:hAnsiTheme="majorHAnsi" w:cs="Times New Roman"/>
               </w:rPr>
             </w:pPr>
+            <w:r>
+              <w:rPr>
+                <w:rFonts w:asciiTheme="majorHAnsi" w:hAnsiTheme="majorHAnsi" w:cs="Times New Roman"/>
+              </w:rPr>
+              <w:t xml:space="preserve">{{ </w:t>
+            </w:r>
+            <w:r>
+              <w:rPr>
+                <w:rFonts w:asciiTheme="majorHAnsi" w:hAnsiTheme="majorHAnsi" w:cs="Times New Roman"/>
+              </w:rPr>
+              <w:t>program_entries[</w:t>
+            </w:r>
+            <w:r>
+              <w:rPr>
+                <w:rFonts w:asciiTheme="majorHAnsi" w:hAnsiTheme="majorHAnsi" w:cs="Times New Roman"/>
+              </w:rPr>
+              <w:t>7</w:t>
+            </w:r>
+            <w:r>
+              <w:rPr>
+                <w:rFonts w:asciiTheme="majorHAnsi" w:hAnsiTheme="majorHAnsi" w:cs="Times New Roman"/>
+              </w:rPr>
+              <w:t>].ppz</w:t>
+            </w:r>
+            <w:r>
+              <w:rPr>
+                <w:rFonts w:asciiTheme="majorHAnsi" w:hAnsiTheme="majorHAnsi" w:cs="Times New Roman"/>
+              </w:rPr>
+              <w:t xml:space="preserve"> }}</w:t>
+            </w:r>
           </w:p>
         </w:tc>
       </w:tr>
@@ -1152,6 +1385,36 @@
                 <w:rFonts w:asciiTheme="majorHAnsi" w:hAnsiTheme="majorHAnsi" w:cs="Times New Roman"/>
               </w:rPr>
             </w:pPr>
+            <w:r>
+              <w:rPr>
+                <w:rFonts w:asciiTheme="majorHAnsi" w:hAnsiTheme="majorHAnsi" w:cs="Times New Roman"/>
+              </w:rPr>
+              <w:t xml:space="preserve">{{ </w:t>
+            </w:r>
+            <w:r>
+              <w:rPr>
+                <w:rFonts w:asciiTheme="majorHAnsi" w:hAnsiTheme="majorHAnsi" w:cs="Times New Roman"/>
+              </w:rPr>
+              <w:t>program_entries[</w:t>
+            </w:r>
+            <w:r>
+              <w:rPr>
+                <w:rFonts w:asciiTheme="majorHAnsi" w:hAnsiTheme="majorHAnsi" w:cs="Times New Roman"/>
+              </w:rPr>
+              <w:t>8</w:t>
+            </w:r>
+            <w:r>
+              <w:rPr>
+                <w:rFonts w:asciiTheme="majorHAnsi" w:hAnsiTheme="majorHAnsi" w:cs="Times New Roman"/>
+              </w:rPr>
+              <w:t>].ppz</w:t>
+            </w:r>
+            <w:r>
+              <w:rPr>
+                <w:rFonts w:asciiTheme="majorHAnsi" w:hAnsiTheme="majorHAnsi" w:cs="Times New Roman"/>
+              </w:rPr>
+              <w:t xml:space="preserve"> }}</w:t>
+            </w:r>
           </w:p>
         </w:tc>
       </w:tr>
@@ -1212,6 +1475,36 @@
                 <w:rFonts w:asciiTheme="majorHAnsi" w:hAnsiTheme="majorHAnsi" w:cs="Times New Roman"/>
               </w:rPr>
             </w:pPr>
+            <w:r>
+              <w:rPr>
+                <w:rFonts w:asciiTheme="majorHAnsi" w:hAnsiTheme="majorHAnsi" w:cs="Times New Roman"/>
+              </w:rPr>
+              <w:t xml:space="preserve">{{ </w:t>
+            </w:r>
+            <w:r>
+              <w:rPr>
+                <w:rFonts w:asciiTheme="majorHAnsi" w:hAnsiTheme="majorHAnsi" w:cs="Times New Roman"/>
+              </w:rPr>
+              <w:t>program_entries[</w:t>
+            </w:r>
+            <w:r>
+              <w:rPr>
+                <w:rFonts w:asciiTheme="majorHAnsi" w:hAnsiTheme="majorHAnsi" w:cs="Times New Roman"/>
+              </w:rPr>
+              <w:t>9</w:t>
+            </w:r>
+            <w:r>
+              <w:rPr>
+                <w:rFonts w:asciiTheme="majorHAnsi" w:hAnsiTheme="majorHAnsi" w:cs="Times New Roman"/>
+              </w:rPr>
+              <w:t>].ppz</w:t>
+            </w:r>
+            <w:r>
+              <w:rPr>
+                <w:rFonts w:asciiTheme="majorHAnsi" w:hAnsiTheme="majorHAnsi" w:cs="Times New Roman"/>
+              </w:rPr>
+              <w:t xml:space="preserve"> }}</w:t>
+            </w:r>
           </w:p>
         </w:tc>
       </w:tr>
@@ -1272,6 +1565,36 @@
                 <w:rFonts w:asciiTheme="majorHAnsi" w:hAnsiTheme="majorHAnsi" w:cs="Times New Roman"/>
               </w:rPr>
             </w:pPr>
+            <w:r>
+              <w:rPr>
+                <w:rFonts w:asciiTheme="majorHAnsi" w:hAnsiTheme="majorHAnsi" w:cs="Times New Roman"/>
+              </w:rPr>
+              <w:t xml:space="preserve">{{ </w:t>
+            </w:r>
+            <w:r>
+              <w:rPr>
+                <w:rFonts w:asciiTheme="majorHAnsi" w:hAnsiTheme="majorHAnsi" w:cs="Times New Roman"/>
+              </w:rPr>
+              <w:t>program_entries[</w:t>
+            </w:r>
+            <w:r>
+              <w:rPr>
+                <w:rFonts w:asciiTheme="majorHAnsi" w:hAnsiTheme="majorHAnsi" w:cs="Times New Roman"/>
+              </w:rPr>
+              <w:t>10</w:t>
+            </w:r>
+            <w:r>
+              <w:rPr>
+                <w:rFonts w:asciiTheme="majorHAnsi" w:hAnsiTheme="majorHAnsi" w:cs="Times New Roman"/>
+              </w:rPr>
+              <w:t>].ppz</w:t>
+            </w:r>
+            <w:r>
+              <w:rPr>
+                <w:rFonts w:asciiTheme="majorHAnsi" w:hAnsiTheme="majorHAnsi" w:cs="Times New Roman"/>
+              </w:rPr>
+              <w:t xml:space="preserve"> }}</w:t>
+            </w:r>
           </w:p>
         </w:tc>
       </w:tr>
@@ -1332,6 +1655,36 @@
                 <w:rFonts w:asciiTheme="majorHAnsi" w:hAnsiTheme="majorHAnsi" w:cs="Times New Roman"/>
               </w:rPr>
             </w:pPr>
+            <w:r>
+              <w:rPr>
+                <w:rFonts w:asciiTheme="majorHAnsi" w:hAnsiTheme="majorHAnsi" w:cs="Times New Roman"/>
+              </w:rPr>
+              <w:t xml:space="preserve">{{ </w:t>
+            </w:r>
+            <w:r>
+              <w:rPr>
+                <w:rFonts w:asciiTheme="majorHAnsi" w:hAnsiTheme="majorHAnsi" w:cs="Times New Roman"/>
+              </w:rPr>
+              <w:t>program_entries[</w:t>
+            </w:r>
+            <w:r>
+              <w:rPr>
+                <w:rFonts w:asciiTheme="majorHAnsi" w:hAnsiTheme="majorHAnsi" w:cs="Times New Roman"/>
+              </w:rPr>
+              <w:t>11</w:t>
+            </w:r>
+            <w:r>
+              <w:rPr>
+                <w:rFonts w:asciiTheme="majorHAnsi" w:hAnsiTheme="majorHAnsi" w:cs="Times New Roman"/>
+              </w:rPr>
+              <w:t>].ppz</w:t>
+            </w:r>
+            <w:r>
+              <w:rPr>
+                <w:rFonts w:asciiTheme="majorHAnsi" w:hAnsiTheme="majorHAnsi" w:cs="Times New Roman"/>
+              </w:rPr>
+              <w:t xml:space="preserve"> }}</w:t>
+            </w:r>
           </w:p>
         </w:tc>
       </w:tr>
@@ -1376,44 +1729,30 @@
               <w:rPr>
                 <w:rFonts w:ascii="Cambria" w:hAnsi="Cambria" w:cs="Calibri"/>
               </w:rPr>
-              <w:t xml:space="preserve">Dostrzega w praktyce tempo </w:t>
-            </w:r>
-            <w:proofErr w:type="spellStart"/>
+              <w:t xml:space="preserve">Dostrzega w praktyce tempo deaktualizacji  wiedzy informatycznej oraz skutki </w:t>
+            </w:r>
             <w:r>
               <w:rPr>
                 <w:rFonts w:ascii="Cambria" w:hAnsi="Cambria" w:cs="Calibri"/>
               </w:rPr>
-              <w:t>deaktualizacji</w:t>
-            </w:r>
-            <w:proofErr w:type="spellEnd"/>
+              <w:t>d</w:t>
+            </w:r>
             <w:r>
               <w:rPr>
                 <w:rFonts w:ascii="Cambria" w:hAnsi="Cambria" w:cs="Calibri"/>
               </w:rPr>
-              <w:t xml:space="preserve">  wiedzy informatycznej oraz skutki </w:t>
+              <w:t xml:space="preserve">ziałalności informatyków </w:t>
             </w:r>
             <w:r>
               <w:rPr>
                 <w:rFonts w:ascii="Cambria" w:hAnsi="Cambria" w:cs="Calibri"/>
               </w:rPr>
-              <w:t>d</w:t>
+              <w:t>w szczególności</w:t>
             </w:r>
             <w:r>
               <w:rPr>
                 <w:rFonts w:ascii="Cambria" w:hAnsi="Cambria" w:cs="Calibri"/>
               </w:rPr>
-              <w:t xml:space="preserve">ziałalności informatyków </w:t>
-            </w:r>
-            <w:r>
-              <w:rPr>
-                <w:rFonts w:ascii="Cambria" w:hAnsi="Cambria" w:cs="Calibri"/>
-              </w:rPr>
-              <w:t>w szczególności</w:t>
-            </w:r>
-            <w:r>
-              <w:rPr>
-                <w:rFonts w:ascii="Cambria" w:hAnsi="Cambria" w:cs="Calibri"/>
-              </w:rPr>
               <w:t xml:space="preserve"> ekonomiczne i społeczne  </w:t>
             </w:r>
           </w:p>
@@ -1429,10 +1768,52 @@
                 <w:rFonts w:asciiTheme="majorHAnsi" w:hAnsiTheme="majorHAnsi" w:cs="Times New Roman"/>
               </w:rPr>
             </w:pPr>
+            <w:r>
+              <w:rPr>
+                <w:rFonts w:asciiTheme="majorHAnsi" w:hAnsiTheme="majorHAnsi" w:cs="Times New Roman"/>
+              </w:rPr>
+              <w:t xml:space="preserve">{{ </w:t>
+            </w:r>
+            <w:r>
+              <w:rPr>
+                <w:rFonts w:asciiTheme="majorHAnsi" w:hAnsiTheme="majorHAnsi" w:cs="Times New Roman"/>
+              </w:rPr>
+              <w:t>program_entries[</w:t>
+            </w:r>
+            <w:r>
+              <w:rPr>
+                <w:rFonts w:asciiTheme="majorHAnsi" w:hAnsiTheme="majorHAnsi" w:cs="Times New Roman"/>
+              </w:rPr>
+              <w:t>12</w:t>
+            </w:r>
+            <w:r>
+              <w:rPr>
+                <w:rFonts w:asciiTheme="majorHAnsi" w:hAnsiTheme="majorHAnsi" w:cs="Times New Roman"/>
+              </w:rPr>
+              <w:t>].ppz</w:t>
+            </w:r>
+            <w:r>
+              <w:rPr>
+                <w:rFonts w:asciiTheme="majorHAnsi" w:hAnsiTheme="majorHAnsi" w:cs="Times New Roman"/>
+              </w:rPr>
+              <w:t xml:space="preserve"> }}</w:t>
+            </w:r>
           </w:p>
         </w:tc>
       </w:tr>
     </w:tbl>
+    <w:p>
+      <w:pPr>
+        <w:spacing w:before="120" w:after="0" w:line="240" w:lineRule="auto"/>
+        <w:jc w:val="center"/>
+        <w:rPr>
+          <w:rFonts w:asciiTheme="majorHAnsi" w:hAnsiTheme="majorHAnsi" w:cs="Times New Roman"/>
+          <w:b/>
+          <w:sz w:val="24"/>
+          <w:szCs w:val="24"/>
+        </w:rPr>
+      </w:pPr>
+    </w:p>
     <w:p>
       <w:pPr>
         <w:spacing w:before="120" w:after="0" w:line="240" w:lineRule="auto"/>
@@ -1579,10 +1960,10 @@
         <w:tblLook w:val="04A0" w:firstRow="1" w:lastRow="0" w:firstColumn="1" w:lastColumn="0" w:noHBand="0" w:noVBand="1"/>
       </w:tblPr>
       <w:tblGrid>
-        <w:gridCol w:w="993"/>
-        <w:gridCol w:w="3991"/>
-        <w:gridCol w:w="1645"/>
-        <w:gridCol w:w="2693"/>
+        <w:gridCol w:w="917"/>
+        <w:gridCol w:w="3453"/>
+        <w:gridCol w:w="1629"/>
+        <w:gridCol w:w="3323"/>
       </w:tblGrid>
       <w:tr>
         <w:tc>
@@ -1740,6 +2121,30 @@
                 <w:rFonts w:asciiTheme="majorHAnsi" w:hAnsiTheme="majorHAnsi" w:cs="Times New Roman"/>
               </w:rPr>
             </w:pPr>
+            <w:r>
+              <w:rPr>
+                <w:rFonts w:asciiTheme="majorHAnsi" w:hAnsiTheme="majorHAnsi" w:cs="Times New Roman"/>
+              </w:rPr>
+              <w:t>{{ program_entries[</w:t>
+            </w:r>
+            <w:r>
+              <w:rPr>
+                <w:rFonts w:asciiTheme="majorHAnsi" w:hAnsiTheme="majorHAnsi" w:cs="Times New Roman"/>
+              </w:rPr>
+              <w:t>0</w:t>
+            </w:r>
+            <w:r>
+              <w:rPr>
+                <w:rFonts w:asciiTheme="majorHAnsi" w:hAnsiTheme="majorHAnsi" w:cs="Times New Roman"/>
+              </w:rPr>
+              <w:t>].hpz</w:t>
+            </w:r>
+            <w:r>
+              <w:rPr>
+                <w:rFonts w:asciiTheme="majorHAnsi" w:hAnsiTheme="majorHAnsi" w:cs="Times New Roman"/>
+              </w:rPr>
+              <w:t xml:space="preserve"> }}</w:t>
+            </w:r>
           </w:p>
         </w:tc>
         <w:tc>
@@ -1756,6 +2161,42 @@
                 <w:rFonts w:asciiTheme="majorHAnsi" w:hAnsiTheme="majorHAnsi" w:cs="Times New Roman"/>
               </w:rPr>
             </w:pPr>
+            <w:r>
+              <w:rPr>
+                <w:rFonts w:asciiTheme="majorHAnsi" w:hAnsiTheme="majorHAnsi" w:cs="Times New Roman"/>
+              </w:rPr>
+              <w:t>{{ program_entries[</w:t>
+            </w:r>
+            <w:r>
+              <w:rPr>
+                <w:rFonts w:asciiTheme="majorHAnsi" w:hAnsiTheme="majorHAnsi" w:cs="Times New Roman"/>
+              </w:rPr>
+              <w:t>0</w:t>
+            </w:r>
+            <w:r>
+              <w:rPr>
+                <w:rFonts w:asciiTheme="majorHAnsi" w:hAnsiTheme="majorHAnsi" w:cs="Times New Roman"/>
+              </w:rPr>
+              <w:t>].dni</w:t>
+            </w:r>
+            <w:r>
+              <w:rPr>
+                <w:rFonts w:asciiTheme="majorHAnsi" w:hAnsiTheme="majorHAnsi" w:cs="Times New Roman"/>
+              </w:rPr>
+              <w:t xml:space="preserve"> </w:t>
+            </w:r>
+            <w:r>
+              <w:rPr>
+                <w:rFonts w:asciiTheme="majorHAnsi" w:hAnsiTheme="majorHAnsi" w:cs="Times New Roman"/>
+              </w:rPr>
+              <w:t>or ''</w:t>
+            </w:r>
+            <w:r>
+              <w:rPr>
+                <w:rFonts w:asciiTheme="majorHAnsi" w:hAnsiTheme="majorHAnsi" w:cs="Times New Roman"/>
+              </w:rPr>
+              <w:t xml:space="preserve"> }}</w:t>
+            </w:r>
           </w:p>
         </w:tc>
       </w:tr>
@@ -1792,6 +2233,30 @@
                 <w:rFonts w:asciiTheme="majorHAnsi" w:hAnsiTheme="majorHAnsi" w:cs="Times New Roman"/>
               </w:rPr>
             </w:pPr>
+            <w:r>
+              <w:rPr>
+                <w:rFonts w:asciiTheme="majorHAnsi" w:hAnsiTheme="majorHAnsi" w:cs="Times New Roman"/>
+              </w:rPr>
+              <w:t>{{ program_entries[</w:t>
+            </w:r>
+            <w:r>
+              <w:rPr>
+                <w:rFonts w:asciiTheme="majorHAnsi" w:hAnsiTheme="majorHAnsi" w:cs="Times New Roman"/>
+              </w:rPr>
+              <w:t>1</w:t>
+            </w:r>
+            <w:r>
+              <w:rPr>
+                <w:rFonts w:asciiTheme="majorHAnsi" w:hAnsiTheme="majorHAnsi" w:cs="Times New Roman"/>
+              </w:rPr>
+              <w:t>].hpz</w:t>
+            </w:r>
+            <w:r>
+              <w:rPr>
+                <w:rFonts w:asciiTheme="majorHAnsi" w:hAnsiTheme="majorHAnsi" w:cs="Times New Roman"/>
+              </w:rPr>
+              <w:t xml:space="preserve"> }}</w:t>
+            </w:r>
           </w:p>
         </w:tc>
         <w:tc>
@@ -1805,6 +2270,36 @@
                 <w:rFonts w:asciiTheme="majorHAnsi" w:hAnsiTheme="majorHAnsi" w:cs="Times New Roman"/>
               </w:rPr>
             </w:pPr>
+            <w:r>
+              <w:rPr>
+                <w:rFonts w:asciiTheme="majorHAnsi" w:hAnsiTheme="majorHAnsi" w:cs="Times New Roman"/>
+              </w:rPr>
+              <w:t>{{ program_entries[</w:t>
+            </w:r>
+            <w:r>
+              <w:rPr>
+                <w:rFonts w:asciiTheme="majorHAnsi" w:hAnsiTheme="majorHAnsi" w:cs="Times New Roman"/>
+              </w:rPr>
+              <w:t>1</w:t>
+            </w:r>
+            <w:r>
+              <w:rPr>
+                <w:rFonts w:asciiTheme="majorHAnsi" w:hAnsiTheme="majorHAnsi" w:cs="Times New Roman"/>
+              </w:rPr>
+              <w:t>].dni</w:t>
+            </w:r>
+            <w:r>
+              <w:t xml:space="preserve"> </w:t>
+            </w:r>
+            <w:r>
+              <w:t>or ''</w:t>
+            </w:r>
+            <w:r>
+              <w:rPr>
+                <w:rFonts w:asciiTheme="majorHAnsi" w:hAnsiTheme="majorHAnsi" w:cs="Times New Roman"/>
+              </w:rPr>
+              <w:t xml:space="preserve"> }}</w:t>
+            </w:r>
           </w:p>
         </w:tc>
       </w:tr>
@@ -1841,6 +2336,30 @@
                 <w:rFonts w:asciiTheme="majorHAnsi" w:hAnsiTheme="majorHAnsi" w:cs="Times New Roman"/>
               </w:rPr>
             </w:pPr>
+            <w:r>
+              <w:rPr>
+                <w:rFonts w:asciiTheme="majorHAnsi" w:hAnsiTheme="majorHAnsi" w:cs="Times New Roman"/>
+              </w:rPr>
+              <w:t>{{ program_entries[</w:t>
+            </w:r>
+            <w:r>
+              <w:rPr>
+                <w:rFonts w:asciiTheme="majorHAnsi" w:hAnsiTheme="majorHAnsi" w:cs="Times New Roman"/>
+              </w:rPr>
+              <w:t>2</w:t>
+            </w:r>
+            <w:r>
+              <w:rPr>
+                <w:rFonts w:asciiTheme="majorHAnsi" w:hAnsiTheme="majorHAnsi" w:cs="Times New Roman"/>
+              </w:rPr>
+              <w:t>].hpz</w:t>
+            </w:r>
+            <w:r>
+              <w:rPr>
+                <w:rFonts w:asciiTheme="majorHAnsi" w:hAnsiTheme="majorHAnsi" w:cs="Times New Roman"/>
+              </w:rPr>
+              <w:t xml:space="preserve"> }}</w:t>
+            </w:r>
           </w:p>
         </w:tc>
         <w:tc>
@@ -1854,6 +2373,42 @@
                 <w:rFonts w:asciiTheme="majorHAnsi" w:hAnsiTheme="majorHAnsi" w:cs="Times New Roman"/>
               </w:rPr>
             </w:pPr>
+            <w:r>
+              <w:rPr>
+                <w:rFonts w:asciiTheme="majorHAnsi" w:hAnsiTheme="majorHAnsi" w:cs="Times New Roman"/>
+              </w:rPr>
+              <w:t>{{ program_entries[</w:t>
+            </w:r>
+            <w:r>
+              <w:rPr>
+                <w:rFonts w:asciiTheme="majorHAnsi" w:hAnsiTheme="majorHAnsi" w:cs="Times New Roman"/>
+              </w:rPr>
+              <w:t>2</w:t>
+            </w:r>
+            <w:r>
+              <w:rPr>
+                <w:rFonts w:asciiTheme="majorHAnsi" w:hAnsiTheme="majorHAnsi" w:cs="Times New Roman"/>
+              </w:rPr>
+              <w:t>].dni</w:t>
+            </w:r>
+            <w:r>
+              <w:rPr>
+                <w:rFonts w:asciiTheme="majorHAnsi" w:hAnsiTheme="majorHAnsi" w:cs="Times New Roman"/>
+              </w:rPr>
+              <w:t xml:space="preserve"> </w:t>
+            </w:r>
+            <w:r>
+              <w:rPr>
+                <w:rFonts w:asciiTheme="majorHAnsi" w:hAnsiTheme="majorHAnsi" w:cs="Times New Roman"/>
+              </w:rPr>
+              <w:t>or ''</w:t>
+            </w:r>
+            <w:r>
+              <w:rPr>
+                <w:rFonts w:asciiTheme="majorHAnsi" w:hAnsiTheme="majorHAnsi" w:cs="Times New Roman"/>
+              </w:rPr>
+              <w:t xml:space="preserve"> }}</w:t>
+            </w:r>
           </w:p>
         </w:tc>
       </w:tr>
@@ -1890,6 +2445,30 @@
                 <w:rFonts w:asciiTheme="majorHAnsi" w:hAnsiTheme="majorHAnsi" w:cs="Times New Roman"/>
               </w:rPr>
             </w:pPr>
+            <w:r>
+              <w:rPr>
+                <w:rFonts w:asciiTheme="majorHAnsi" w:hAnsiTheme="majorHAnsi" w:cs="Times New Roman"/>
+              </w:rPr>
+              <w:t>{{ program_entries[</w:t>
+            </w:r>
+            <w:r>
+              <w:rPr>
+                <w:rFonts w:asciiTheme="majorHAnsi" w:hAnsiTheme="majorHAnsi" w:cs="Times New Roman"/>
+              </w:rPr>
+              <w:t>3</w:t>
+            </w:r>
+            <w:r>
+              <w:rPr>
+                <w:rFonts w:asciiTheme="majorHAnsi" w:hAnsiTheme="majorHAnsi" w:cs="Times New Roman"/>
+              </w:rPr>
+              <w:t>].hpz</w:t>
+            </w:r>
+            <w:r>
+              <w:rPr>
+                <w:rFonts w:asciiTheme="majorHAnsi" w:hAnsiTheme="majorHAnsi" w:cs="Times New Roman"/>
+              </w:rPr>
+              <w:t xml:space="preserve"> }}</w:t>
+            </w:r>
           </w:p>
         </w:tc>
         <w:tc>
@@ -1903,6 +2482,42 @@
                 <w:rFonts w:asciiTheme="majorHAnsi" w:hAnsiTheme="majorHAnsi" w:cs="Times New Roman"/>
               </w:rPr>
             </w:pPr>
+            <w:r>
+              <w:rPr>
+                <w:rFonts w:asciiTheme="majorHAnsi" w:hAnsiTheme="majorHAnsi" w:cs="Times New Roman"/>
+              </w:rPr>
+              <w:t>{{ program_entries[</w:t>
+            </w:r>
+            <w:r>
+              <w:rPr>
+                <w:rFonts w:asciiTheme="majorHAnsi" w:hAnsiTheme="majorHAnsi" w:cs="Times New Roman"/>
+              </w:rPr>
+              <w:t>3</w:t>
+            </w:r>
+            <w:r>
+              <w:rPr>
+                <w:rFonts w:asciiTheme="majorHAnsi" w:hAnsiTheme="majorHAnsi" w:cs="Times New Roman"/>
+              </w:rPr>
+              <w:t>].dni</w:t>
+            </w:r>
+            <w:r>
+              <w:rPr>
+                <w:rFonts w:asciiTheme="majorHAnsi" w:hAnsiTheme="majorHAnsi" w:cs="Times New Roman"/>
+              </w:rPr>
+              <w:t xml:space="preserve"> </w:t>
+            </w:r>
+            <w:r>
+              <w:rPr>
+                <w:rFonts w:asciiTheme="majorHAnsi" w:hAnsiTheme="majorHAnsi" w:cs="Times New Roman"/>
+              </w:rPr>
+              <w:t>or ''</w:t>
+            </w:r>
+            <w:r>
+              <w:rPr>
+                <w:rFonts w:asciiTheme="majorHAnsi" w:hAnsiTheme="majorHAnsi" w:cs="Times New Roman"/>
+              </w:rPr>
+              <w:t xml:space="preserve"> }}</w:t>
+            </w:r>
           </w:p>
         </w:tc>
       </w:tr>
@@ -1939,6 +2554,30 @@
                 <w:rFonts w:asciiTheme="majorHAnsi" w:hAnsiTheme="majorHAnsi" w:cs="Times New Roman"/>
               </w:rPr>
             </w:pPr>
+            <w:r>
+              <w:rPr>
+                <w:rFonts w:asciiTheme="majorHAnsi" w:hAnsiTheme="majorHAnsi" w:cs="Times New Roman"/>
+              </w:rPr>
+              <w:t>{{ program_entries[</w:t>
+            </w:r>
+            <w:r>
+              <w:rPr>
+                <w:rFonts w:asciiTheme="majorHAnsi" w:hAnsiTheme="majorHAnsi" w:cs="Times New Roman"/>
+              </w:rPr>
+              <w:t>4</w:t>
+            </w:r>
+            <w:r>
+              <w:rPr>
+                <w:rFonts w:asciiTheme="majorHAnsi" w:hAnsiTheme="majorHAnsi" w:cs="Times New Roman"/>
+              </w:rPr>
+              <w:t>].hpz</w:t>
+            </w:r>
+            <w:r>
+              <w:rPr>
+                <w:rFonts w:asciiTheme="majorHAnsi" w:hAnsiTheme="majorHAnsi" w:cs="Times New Roman"/>
+              </w:rPr>
+              <w:t xml:space="preserve"> }}</w:t>
+            </w:r>
           </w:p>
         </w:tc>
         <w:tc>
@@ -1952,6 +2591,42 @@
                 <w:rFonts w:asciiTheme="majorHAnsi" w:hAnsiTheme="majorHAnsi" w:cs="Times New Roman"/>
               </w:rPr>
             </w:pPr>
+            <w:r>
+              <w:rPr>
+                <w:rFonts w:asciiTheme="majorHAnsi" w:hAnsiTheme="majorHAnsi" w:cs="Times New Roman"/>
+              </w:rPr>
+              <w:t>{{ program_entries[</w:t>
+            </w:r>
+            <w:r>
+              <w:rPr>
+                <w:rFonts w:asciiTheme="majorHAnsi" w:hAnsiTheme="majorHAnsi" w:cs="Times New Roman"/>
+              </w:rPr>
+              <w:t>4</w:t>
+            </w:r>
+            <w:r>
+              <w:rPr>
+                <w:rFonts w:asciiTheme="majorHAnsi" w:hAnsiTheme="majorHAnsi" w:cs="Times New Roman"/>
+              </w:rPr>
+              <w:t>].dni</w:t>
+            </w:r>
+            <w:r>
+              <w:rPr>
+                <w:rFonts w:asciiTheme="majorHAnsi" w:hAnsiTheme="majorHAnsi" w:cs="Times New Roman"/>
+              </w:rPr>
+              <w:t xml:space="preserve"> </w:t>
+            </w:r>
+            <w:r>
+              <w:rPr>
+                <w:rFonts w:asciiTheme="majorHAnsi" w:hAnsiTheme="majorHAnsi" w:cs="Times New Roman"/>
+              </w:rPr>
+              <w:t>or ''</w:t>
+            </w:r>
+            <w:r>
+              <w:rPr>
+                <w:rFonts w:asciiTheme="majorHAnsi" w:hAnsiTheme="majorHAnsi" w:cs="Times New Roman"/>
+              </w:rPr>
+              <w:t xml:space="preserve"> }}</w:t>
+            </w:r>
           </w:p>
         </w:tc>
       </w:tr>
@@ -1988,6 +2663,30 @@
                 <w:rFonts w:asciiTheme="majorHAnsi" w:hAnsiTheme="majorHAnsi" w:cs="Times New Roman"/>
               </w:rPr>
             </w:pPr>
+            <w:r>
+              <w:rPr>
+                <w:rFonts w:asciiTheme="majorHAnsi" w:hAnsiTheme="majorHAnsi" w:cs="Times New Roman"/>
+              </w:rPr>
+              <w:t>{{ program_entries[</w:t>
+            </w:r>
+            <w:r>
+              <w:rPr>
+                <w:rFonts w:asciiTheme="majorHAnsi" w:hAnsiTheme="majorHAnsi" w:cs="Times New Roman"/>
+              </w:rPr>
+              <w:t>5</w:t>
+            </w:r>
+            <w:r>
+              <w:rPr>
+                <w:rFonts w:asciiTheme="majorHAnsi" w:hAnsiTheme="majorHAnsi" w:cs="Times New Roman"/>
+              </w:rPr>
+              <w:t>].hpz</w:t>
+            </w:r>
+            <w:r>
+              <w:rPr>
+                <w:rFonts w:asciiTheme="majorHAnsi" w:hAnsiTheme="majorHAnsi" w:cs="Times New Roman"/>
+              </w:rPr>
+              <w:t xml:space="preserve"> }}</w:t>
+            </w:r>
           </w:p>
         </w:tc>
         <w:tc>
@@ -2001,6 +2700,42 @@
                 <w:rFonts w:asciiTheme="majorHAnsi" w:hAnsiTheme="majorHAnsi" w:cs="Times New Roman"/>
               </w:rPr>
             </w:pPr>
+            <w:r>
+              <w:rPr>
+                <w:rFonts w:asciiTheme="majorHAnsi" w:hAnsiTheme="majorHAnsi" w:cs="Times New Roman"/>
+              </w:rPr>
+              <w:t>{{ program_entries[</w:t>
+            </w:r>
+            <w:r>
+              <w:rPr>
+                <w:rFonts w:asciiTheme="majorHAnsi" w:hAnsiTheme="majorHAnsi" w:cs="Times New Roman"/>
+              </w:rPr>
+              <w:t>5</w:t>
+            </w:r>
+            <w:r>
+              <w:rPr>
+                <w:rFonts w:asciiTheme="majorHAnsi" w:hAnsiTheme="majorHAnsi" w:cs="Times New Roman"/>
+              </w:rPr>
+              <w:t>].dni</w:t>
+            </w:r>
+            <w:r>
+              <w:rPr>
+                <w:rFonts w:asciiTheme="majorHAnsi" w:hAnsiTheme="majorHAnsi" w:cs="Times New Roman"/>
+              </w:rPr>
+              <w:t xml:space="preserve"> </w:t>
+            </w:r>
+            <w:r>
+              <w:rPr>
+                <w:rFonts w:asciiTheme="majorHAnsi" w:hAnsiTheme="majorHAnsi" w:cs="Times New Roman"/>
+              </w:rPr>
+              <w:t>or ''</w:t>
+            </w:r>
+            <w:r>
+              <w:rPr>
+                <w:rFonts w:asciiTheme="majorHAnsi" w:hAnsiTheme="majorHAnsi" w:cs="Times New Roman"/>
+              </w:rPr>
+              <w:t xml:space="preserve"> }}</w:t>
+            </w:r>
           </w:p>
         </w:tc>
       </w:tr>
@@ -2037,6 +2772,30 @@
                 <w:rFonts w:asciiTheme="majorHAnsi" w:hAnsiTheme="majorHAnsi" w:cs="Times New Roman"/>
               </w:rPr>
             </w:pPr>
+            <w:r>
+              <w:rPr>
+                <w:rFonts w:asciiTheme="majorHAnsi" w:hAnsiTheme="majorHAnsi" w:cs="Times New Roman"/>
+              </w:rPr>
+              <w:t>{{ program_entries[</w:t>
+            </w:r>
+            <w:r>
+              <w:rPr>
+                <w:rFonts w:asciiTheme="majorHAnsi" w:hAnsiTheme="majorHAnsi" w:cs="Times New Roman"/>
+              </w:rPr>
+              <w:t>6</w:t>
+            </w:r>
+            <w:r>
+              <w:rPr>
+                <w:rFonts w:asciiTheme="majorHAnsi" w:hAnsiTheme="majorHAnsi" w:cs="Times New Roman"/>
+              </w:rPr>
+              <w:t>].hpz</w:t>
+            </w:r>
+            <w:r>
+              <w:rPr>
+                <w:rFonts w:asciiTheme="majorHAnsi" w:hAnsiTheme="majorHAnsi" w:cs="Times New Roman"/>
+              </w:rPr>
+              <w:t xml:space="preserve"> }}</w:t>
+            </w:r>
           </w:p>
         </w:tc>
         <w:tc>
@@ -2050,6 +2809,42 @@
                 <w:rFonts w:asciiTheme="majorHAnsi" w:hAnsiTheme="majorHAnsi" w:cs="Times New Roman"/>
               </w:rPr>
             </w:pPr>
+            <w:r>
+              <w:rPr>
+                <w:rFonts w:asciiTheme="majorHAnsi" w:hAnsiTheme="majorHAnsi" w:cs="Times New Roman"/>
+              </w:rPr>
+              <w:t>{{ program_entries[</w:t>
+            </w:r>
+            <w:r>
+              <w:rPr>
+                <w:rFonts w:asciiTheme="majorHAnsi" w:hAnsiTheme="majorHAnsi" w:cs="Times New Roman"/>
+              </w:rPr>
+              <w:t>6</w:t>
+            </w:r>
+            <w:r>
+              <w:rPr>
+                <w:rFonts w:asciiTheme="majorHAnsi" w:hAnsiTheme="majorHAnsi" w:cs="Times New Roman"/>
+              </w:rPr>
+              <w:t>].dni</w:t>
+            </w:r>
+            <w:r>
+              <w:rPr>
+                <w:rFonts w:asciiTheme="majorHAnsi" w:hAnsiTheme="majorHAnsi" w:cs="Times New Roman"/>
+              </w:rPr>
+              <w:t xml:space="preserve"> </w:t>
+            </w:r>
+            <w:r>
+              <w:rPr>
+                <w:rFonts w:asciiTheme="majorHAnsi" w:hAnsiTheme="majorHAnsi" w:cs="Times New Roman"/>
+              </w:rPr>
+              <w:t>or ''</w:t>
+            </w:r>
+            <w:r>
+              <w:rPr>
+                <w:rFonts w:asciiTheme="majorHAnsi" w:hAnsiTheme="majorHAnsi" w:cs="Times New Roman"/>
+              </w:rPr>
+              <w:t xml:space="preserve"> }}</w:t>
+            </w:r>
           </w:p>
         </w:tc>
       </w:tr>
@@ -2086,6 +2881,30 @@
                 <w:rFonts w:asciiTheme="majorHAnsi" w:hAnsiTheme="majorHAnsi" w:cs="Times New Roman"/>
               </w:rPr>
             </w:pPr>
+            <w:r>
+              <w:rPr>
+                <w:rFonts w:asciiTheme="majorHAnsi" w:hAnsiTheme="majorHAnsi" w:cs="Times New Roman"/>
+              </w:rPr>
+              <w:t>{{ program_entries[</w:t>
+            </w:r>
+            <w:r>
+              <w:rPr>
+                <w:rFonts w:asciiTheme="majorHAnsi" w:hAnsiTheme="majorHAnsi" w:cs="Times New Roman"/>
+              </w:rPr>
+              <w:t>7</w:t>
+            </w:r>
+            <w:r>
+              <w:rPr>
+                <w:rFonts w:asciiTheme="majorHAnsi" w:hAnsiTheme="majorHAnsi" w:cs="Times New Roman"/>
+              </w:rPr>
+              <w:t>].hpz</w:t>
+            </w:r>
+            <w:r>
+              <w:rPr>
+                <w:rFonts w:asciiTheme="majorHAnsi" w:hAnsiTheme="majorHAnsi" w:cs="Times New Roman"/>
+              </w:rPr>
+              <w:t xml:space="preserve"> }}</w:t>
+            </w:r>
           </w:p>
         </w:tc>
         <w:tc>
@@ -2099,6 +2918,42 @@
                 <w:rFonts w:asciiTheme="majorHAnsi" w:hAnsiTheme="majorHAnsi" w:cs="Times New Roman"/>
               </w:rPr>
             </w:pPr>
+            <w:r>
+              <w:rPr>
+                <w:rFonts w:asciiTheme="majorHAnsi" w:hAnsiTheme="majorHAnsi" w:cs="Times New Roman"/>
+              </w:rPr>
+              <w:t>{{ program_entries[</w:t>
+            </w:r>
+            <w:r>
+              <w:rPr>
+                <w:rFonts w:asciiTheme="majorHAnsi" w:hAnsiTheme="majorHAnsi" w:cs="Times New Roman"/>
+              </w:rPr>
+              <w:t>7</w:t>
+            </w:r>
+            <w:r>
+              <w:rPr>
+                <w:rFonts w:asciiTheme="majorHAnsi" w:hAnsiTheme="majorHAnsi" w:cs="Times New Roman"/>
+              </w:rPr>
+              <w:t>].dni</w:t>
+            </w:r>
+            <w:r>
+              <w:rPr>
+                <w:rFonts w:asciiTheme="majorHAnsi" w:hAnsiTheme="majorHAnsi" w:cs="Times New Roman"/>
+              </w:rPr>
+              <w:t xml:space="preserve"> </w:t>
+            </w:r>
+            <w:r>
+              <w:rPr>
+                <w:rFonts w:asciiTheme="majorHAnsi" w:hAnsiTheme="majorHAnsi" w:cs="Times New Roman"/>
+              </w:rPr>
+              <w:t>or ''</w:t>
+            </w:r>
+            <w:r>
+              <w:rPr>
+                <w:rFonts w:asciiTheme="majorHAnsi" w:hAnsiTheme="majorHAnsi" w:cs="Times New Roman"/>
+              </w:rPr>
+              <w:t xml:space="preserve"> }}</w:t>
+            </w:r>
           </w:p>
         </w:tc>
       </w:tr>
@@ -2135,6 +2990,30 @@
                 <w:rFonts w:asciiTheme="majorHAnsi" w:hAnsiTheme="majorHAnsi" w:cs="Times New Roman"/>
               </w:rPr>
             </w:pPr>
+            <w:r>
+              <w:rPr>
+                <w:rFonts w:asciiTheme="majorHAnsi" w:hAnsiTheme="majorHAnsi" w:cs="Times New Roman"/>
+              </w:rPr>
+              <w:t>{{ program_entries[</w:t>
+            </w:r>
+            <w:r>
+              <w:rPr>
+                <w:rFonts w:asciiTheme="majorHAnsi" w:hAnsiTheme="majorHAnsi" w:cs="Times New Roman"/>
+              </w:rPr>
+              <w:t>8</w:t>
+            </w:r>
+            <w:r>
+              <w:rPr>
+                <w:rFonts w:asciiTheme="majorHAnsi" w:hAnsiTheme="majorHAnsi" w:cs="Times New Roman"/>
+              </w:rPr>
+              <w:t>].hpz</w:t>
+            </w:r>
+            <w:r>
+              <w:rPr>
+                <w:rFonts w:asciiTheme="majorHAnsi" w:hAnsiTheme="majorHAnsi" w:cs="Times New Roman"/>
+              </w:rPr>
+              <w:t xml:space="preserve"> }}</w:t>
+            </w:r>
           </w:p>
         </w:tc>
         <w:tc>
@@ -2148,6 +3027,42 @@
                 <w:rFonts w:asciiTheme="majorHAnsi" w:hAnsiTheme="majorHAnsi" w:cs="Times New Roman"/>
               </w:rPr>
             </w:pPr>
+            <w:r>
+              <w:rPr>
+                <w:rFonts w:asciiTheme="majorHAnsi" w:hAnsiTheme="majorHAnsi" w:cs="Times New Roman"/>
+              </w:rPr>
+              <w:t>{{ program_entries[</w:t>
+            </w:r>
+            <w:r>
+              <w:rPr>
+                <w:rFonts w:asciiTheme="majorHAnsi" w:hAnsiTheme="majorHAnsi" w:cs="Times New Roman"/>
+              </w:rPr>
+              <w:t>8</w:t>
+            </w:r>
+            <w:r>
+              <w:rPr>
+                <w:rFonts w:asciiTheme="majorHAnsi" w:hAnsiTheme="majorHAnsi" w:cs="Times New Roman"/>
+              </w:rPr>
+              <w:t>].dni</w:t>
+            </w:r>
+            <w:r>
+              <w:rPr>
+                <w:rFonts w:asciiTheme="majorHAnsi" w:hAnsiTheme="majorHAnsi" w:cs="Times New Roman"/>
+              </w:rPr>
+              <w:t xml:space="preserve"> </w:t>
+            </w:r>
+            <w:r>
+              <w:rPr>
+                <w:rFonts w:asciiTheme="majorHAnsi" w:hAnsiTheme="majorHAnsi" w:cs="Times New Roman"/>
+              </w:rPr>
+              <w:t>or ''</w:t>
+            </w:r>
+            <w:r>
+              <w:rPr>
+                <w:rFonts w:asciiTheme="majorHAnsi" w:hAnsiTheme="majorHAnsi" w:cs="Times New Roman"/>
+              </w:rPr>
+              <w:t xml:space="preserve"> }}</w:t>
+            </w:r>
           </w:p>
         </w:tc>
       </w:tr>
@@ -2184,6 +3099,30 @@
                 <w:rFonts w:asciiTheme="majorHAnsi" w:hAnsiTheme="majorHAnsi" w:cs="Times New Roman"/>
               </w:rPr>
             </w:pPr>
+            <w:r>
+              <w:rPr>
+                <w:rFonts w:asciiTheme="majorHAnsi" w:hAnsiTheme="majorHAnsi" w:cs="Times New Roman"/>
+              </w:rPr>
+              <w:t>{{ program_entries[</w:t>
+            </w:r>
+            <w:r>
+              <w:rPr>
+                <w:rFonts w:asciiTheme="majorHAnsi" w:hAnsiTheme="majorHAnsi" w:cs="Times New Roman"/>
+              </w:rPr>
+              <w:t>9</w:t>
+            </w:r>
+            <w:r>
+              <w:rPr>
+                <w:rFonts w:asciiTheme="majorHAnsi" w:hAnsiTheme="majorHAnsi" w:cs="Times New Roman"/>
+              </w:rPr>
+              <w:t>].hpz</w:t>
+            </w:r>
+            <w:r>
+              <w:rPr>
+                <w:rFonts w:asciiTheme="majorHAnsi" w:hAnsiTheme="majorHAnsi" w:cs="Times New Roman"/>
+              </w:rPr>
+              <w:t xml:space="preserve"> }}</w:t>
+            </w:r>
           </w:p>
         </w:tc>
         <w:tc>
@@ -2197,6 +3136,42 @@
                 <w:rFonts w:asciiTheme="majorHAnsi" w:hAnsiTheme="majorHAnsi" w:cs="Times New Roman"/>
               </w:rPr>
             </w:pPr>
+            <w:r>
+              <w:rPr>
+                <w:rFonts w:asciiTheme="majorHAnsi" w:hAnsiTheme="majorHAnsi" w:cs="Times New Roman"/>
+              </w:rPr>
+              <w:t>{{ program_entries[</w:t>
+            </w:r>
+            <w:r>
+              <w:rPr>
+                <w:rFonts w:asciiTheme="majorHAnsi" w:hAnsiTheme="majorHAnsi" w:cs="Times New Roman"/>
+              </w:rPr>
+              <w:t>9</w:t>
+            </w:r>
+            <w:r>
+              <w:rPr>
+                <w:rFonts w:asciiTheme="majorHAnsi" w:hAnsiTheme="majorHAnsi" w:cs="Times New Roman"/>
+              </w:rPr>
+              <w:t>].dni</w:t>
+            </w:r>
+            <w:r>
+              <w:rPr>
+                <w:rFonts w:asciiTheme="majorHAnsi" w:hAnsiTheme="majorHAnsi" w:cs="Times New Roman"/>
+              </w:rPr>
+              <w:t xml:space="preserve"> </w:t>
+            </w:r>
+            <w:r>
+              <w:rPr>
+                <w:rFonts w:asciiTheme="majorHAnsi" w:hAnsiTheme="majorHAnsi" w:cs="Times New Roman"/>
+              </w:rPr>
+              <w:t>or ''</w:t>
+            </w:r>
+            <w:r>
+              <w:rPr>
+                <w:rFonts w:asciiTheme="majorHAnsi" w:hAnsiTheme="majorHAnsi" w:cs="Times New Roman"/>
+              </w:rPr>
+              <w:t xml:space="preserve"> }}</w:t>
+            </w:r>
           </w:p>
         </w:tc>
       </w:tr>
@@ -2233,6 +3208,30 @@
                 <w:rFonts w:asciiTheme="majorHAnsi" w:hAnsiTheme="majorHAnsi" w:cs="Times New Roman"/>
               </w:rPr>
             </w:pPr>
+            <w:r>
+              <w:rPr>
+                <w:rFonts w:asciiTheme="majorHAnsi" w:hAnsiTheme="majorHAnsi" w:cs="Times New Roman"/>
+              </w:rPr>
+              <w:t>{{ program_entries[</w:t>
+            </w:r>
+            <w:r>
+              <w:rPr>
+                <w:rFonts w:asciiTheme="majorHAnsi" w:hAnsiTheme="majorHAnsi" w:cs="Times New Roman"/>
+              </w:rPr>
+              <w:t>10</w:t>
+            </w:r>
+            <w:r>
+              <w:rPr>
+                <w:rFonts w:asciiTheme="majorHAnsi" w:hAnsiTheme="majorHAnsi" w:cs="Times New Roman"/>
+              </w:rPr>
+              <w:t>].hpz</w:t>
+            </w:r>
+            <w:r>
+              <w:rPr>
+                <w:rFonts w:asciiTheme="majorHAnsi" w:hAnsiTheme="majorHAnsi" w:cs="Times New Roman"/>
+              </w:rPr>
+              <w:t xml:space="preserve"> }}</w:t>
+            </w:r>
           </w:p>
         </w:tc>
         <w:tc>
@@ -2246,6 +3245,42 @@
                 <w:rFonts w:asciiTheme="majorHAnsi" w:hAnsiTheme="majorHAnsi" w:cs="Times New Roman"/>
               </w:rPr>
             </w:pPr>
+            <w:r>
+              <w:rPr>
+                <w:rFonts w:asciiTheme="majorHAnsi" w:hAnsiTheme="majorHAnsi" w:cs="Times New Roman"/>
+              </w:rPr>
+              <w:t>{{ program_entries[</w:t>
+            </w:r>
+            <w:r>
+              <w:rPr>
+                <w:rFonts w:asciiTheme="majorHAnsi" w:hAnsiTheme="majorHAnsi" w:cs="Times New Roman"/>
+              </w:rPr>
+              <w:t>10</w:t>
+            </w:r>
+            <w:r>
+              <w:rPr>
+                <w:rFonts w:asciiTheme="majorHAnsi" w:hAnsiTheme="majorHAnsi" w:cs="Times New Roman"/>
+              </w:rPr>
+              <w:t>].dni</w:t>
+            </w:r>
+            <w:r>
+              <w:rPr>
+                <w:rFonts w:asciiTheme="majorHAnsi" w:hAnsiTheme="majorHAnsi" w:cs="Times New Roman"/>
+              </w:rPr>
+              <w:t xml:space="preserve"> </w:t>
+            </w:r>
+            <w:r>
+              <w:rPr>
+                <w:rFonts w:asciiTheme="majorHAnsi" w:hAnsiTheme="majorHAnsi" w:cs="Times New Roman"/>
+              </w:rPr>
+              <w:t>or ''</w:t>
+            </w:r>
+            <w:r>
+              <w:rPr>
+                <w:rFonts w:asciiTheme="majorHAnsi" w:hAnsiTheme="majorHAnsi" w:cs="Times New Roman"/>
+              </w:rPr>
+              <w:t xml:space="preserve"> }}</w:t>
+            </w:r>
           </w:p>
         </w:tc>
       </w:tr>
@@ -2282,6 +3317,30 @@
                 <w:rFonts w:asciiTheme="majorHAnsi" w:hAnsiTheme="majorHAnsi" w:cs="Times New Roman"/>
               </w:rPr>
             </w:pPr>
+            <w:r>
+              <w:rPr>
+                <w:rFonts w:asciiTheme="majorHAnsi" w:hAnsiTheme="majorHAnsi" w:cs="Times New Roman"/>
+              </w:rPr>
+              <w:t>{{ program_entries[</w:t>
+            </w:r>
+            <w:r>
+              <w:rPr>
+                <w:rFonts w:asciiTheme="majorHAnsi" w:hAnsiTheme="majorHAnsi" w:cs="Times New Roman"/>
+              </w:rPr>
+              <w:t>11</w:t>
+            </w:r>
+            <w:r>
+              <w:rPr>
+                <w:rFonts w:asciiTheme="majorHAnsi" w:hAnsiTheme="majorHAnsi" w:cs="Times New Roman"/>
+              </w:rPr>
+              <w:t>].hpz</w:t>
+            </w:r>
+            <w:r>
+              <w:rPr>
+                <w:rFonts w:asciiTheme="majorHAnsi" w:hAnsiTheme="majorHAnsi" w:cs="Times New Roman"/>
+              </w:rPr>
+              <w:t xml:space="preserve"> }}</w:t>
+            </w:r>
           </w:p>
         </w:tc>
         <w:tc>
@@ -2295,6 +3354,42 @@
                 <w:rFonts w:asciiTheme="majorHAnsi" w:hAnsiTheme="majorHAnsi" w:cs="Times New Roman"/>
               </w:rPr>
             </w:pPr>
+            <w:r>
+              <w:rPr>
+                <w:rFonts w:asciiTheme="majorHAnsi" w:hAnsiTheme="majorHAnsi" w:cs="Times New Roman"/>
+              </w:rPr>
+              <w:t>{{ program_entries[</w:t>
+            </w:r>
+            <w:r>
+              <w:rPr>
+                <w:rFonts w:asciiTheme="majorHAnsi" w:hAnsiTheme="majorHAnsi" w:cs="Times New Roman"/>
+              </w:rPr>
+              <w:t>11</w:t>
+            </w:r>
+            <w:r>
+              <w:rPr>
+                <w:rFonts w:asciiTheme="majorHAnsi" w:hAnsiTheme="majorHAnsi" w:cs="Times New Roman"/>
+              </w:rPr>
+              <w:t>].dni</w:t>
+            </w:r>
+            <w:r>
+              <w:rPr>
+                <w:rFonts w:asciiTheme="majorHAnsi" w:hAnsiTheme="majorHAnsi" w:cs="Times New Roman"/>
+              </w:rPr>
+              <w:t xml:space="preserve"> </w:t>
+            </w:r>
+            <w:r>
+              <w:rPr>
+                <w:rFonts w:asciiTheme="majorHAnsi" w:hAnsiTheme="majorHAnsi" w:cs="Times New Roman"/>
+              </w:rPr>
+              <w:t>or ''</w:t>
+            </w:r>
+            <w:r>
+              <w:rPr>
+                <w:rFonts w:asciiTheme="majorHAnsi" w:hAnsiTheme="majorHAnsi" w:cs="Times New Roman"/>
+              </w:rPr>
+              <w:t xml:space="preserve"> }}</w:t>
+            </w:r>
           </w:p>
         </w:tc>
       </w:tr>
@@ -2331,6 +3426,30 @@
                 <w:rFonts w:asciiTheme="majorHAnsi" w:hAnsiTheme="majorHAnsi" w:cs="Times New Roman"/>
               </w:rPr>
             </w:pPr>
+            <w:r>
+              <w:rPr>
+                <w:rFonts w:asciiTheme="majorHAnsi" w:hAnsiTheme="majorHAnsi" w:cs="Times New Roman"/>
+              </w:rPr>
+              <w:t>{{ program_entries[</w:t>
+            </w:r>
+            <w:r>
+              <w:rPr>
+                <w:rFonts w:asciiTheme="majorHAnsi" w:hAnsiTheme="majorHAnsi" w:cs="Times New Roman"/>
+              </w:rPr>
+              <w:t>12</w:t>
+            </w:r>
+            <w:r>
+              <w:rPr>
+                <w:rFonts w:asciiTheme="majorHAnsi" w:hAnsiTheme="majorHAnsi" w:cs="Times New Roman"/>
+              </w:rPr>
+              <w:t>].hpz</w:t>
+            </w:r>
+            <w:r>
+              <w:rPr>
+                <w:rFonts w:asciiTheme="majorHAnsi" w:hAnsiTheme="majorHAnsi" w:cs="Times New Roman"/>
+              </w:rPr>
+              <w:t xml:space="preserve"> }}</w:t>
+            </w:r>
           </w:p>
         </w:tc>
         <w:tc>
@@ -2344,6 +3463,42 @@
                 <w:rFonts w:asciiTheme="majorHAnsi" w:hAnsiTheme="majorHAnsi" w:cs="Times New Roman"/>
               </w:rPr>
             </w:pPr>
+            <w:r>
+              <w:rPr>
+                <w:rFonts w:asciiTheme="majorHAnsi" w:hAnsiTheme="majorHAnsi" w:cs="Times New Roman"/>
+              </w:rPr>
+              <w:t>{{ program_entries[</w:t>
+            </w:r>
+            <w:r>
+              <w:rPr>
+                <w:rFonts w:asciiTheme="majorHAnsi" w:hAnsiTheme="majorHAnsi" w:cs="Times New Roman"/>
+              </w:rPr>
+              <w:t>12</w:t>
+            </w:r>
+            <w:r>
+              <w:rPr>
+                <w:rFonts w:asciiTheme="majorHAnsi" w:hAnsiTheme="majorHAnsi" w:cs="Times New Roman"/>
+              </w:rPr>
+              <w:t>].dni</w:t>
+            </w:r>
+            <w:r>
+              <w:rPr>
+                <w:rFonts w:asciiTheme="majorHAnsi" w:hAnsiTheme="majorHAnsi" w:cs="Times New Roman"/>
+              </w:rPr>
+              <w:t xml:space="preserve"> </w:t>
+            </w:r>
+            <w:r>
+              <w:rPr>
+                <w:rFonts w:asciiTheme="majorHAnsi" w:hAnsiTheme="majorHAnsi" w:cs="Times New Roman"/>
+              </w:rPr>
+              <w:t>or ''</w:t>
+            </w:r>
+            <w:r>
+              <w:rPr>
+                <w:rFonts w:asciiTheme="majorHAnsi" w:hAnsiTheme="majorHAnsi" w:cs="Times New Roman"/>
+              </w:rPr>
+              <w:t xml:space="preserve"> }}</w:t>
+            </w:r>
           </w:p>
         </w:tc>
       </w:tr>
@@ -2393,10 +3548,23 @@
           <w:p>
             <w:pPr>
               <w:spacing w:before="120" w:after="120"/>
-              <w:rPr>
-                <w:rFonts w:asciiTheme="majorHAnsi" w:hAnsiTheme="majorHAnsi" w:cs="Times New Roman"/>
-              </w:rPr>
-            </w:pPr>
+              <w:jc w:val="center"/>
+              <w:rPr>
+                <w:rFonts w:asciiTheme="majorHAnsi" w:hAnsiTheme="majorHAnsi" w:cs="Times New Roman"/>
+              </w:rPr>
+            </w:pPr>
+            <w:r>
+              <w:rPr>
+                <w:rFonts w:asciiTheme="majorHAnsi" w:hAnsiTheme="majorHAnsi" w:cs="Times New Roman"/>
+              </w:rPr>
+              <w:t>{{ dokument_data.get('lacznie_dni'</w:t>
+            </w:r>
+            <w:r>
+              <w:rPr>
+                <w:rFonts w:asciiTheme="majorHAnsi" w:hAnsiTheme="majorHAnsi" w:cs="Times New Roman"/>
+              </w:rPr>
+              <w:t>) }}</w:t>
+            </w:r>
           </w:p>
         </w:tc>
       </w:tr>
@@ -2512,7 +3680,23 @@
           <w:sz w:val="20"/>
           <w:szCs w:val="20"/>
         </w:rPr>
-        <w:t>Uzgodniono w dniu: …………………………………………</w:t>
+        <w:t xml:space="preserve">Uzgodniono w dniu: </w:t>
+      </w:r>
+      <w:r>
+        <w:rPr>
+          <w:rFonts w:asciiTheme="majorHAnsi" w:hAnsiTheme="majorHAnsi" w:cs="Times New Roman"/>
+          <w:sz w:val="20"/>
+          <w:szCs w:val="20"/>
+        </w:rPr>
+        <w:t>{{ dokument_data.get('data_uzgodnienia')</w:t>
+      </w:r>
+      <w:r>
+        <w:rPr>
+          <w:rFonts w:asciiTheme="majorHAnsi" w:hAnsiTheme="majorHAnsi" w:cs="Times New Roman"/>
+          <w:sz w:val="20"/>
+          <w:szCs w:val="20"/>
+        </w:rPr>
+        <w:t xml:space="preserve"> }}</w:t>
       </w:r>
     </w:p>
     <w:p>
@@ -2576,15 +3760,33 @@
               <w:jc w:val="center"/>
               <w:rPr>
                 <w:rFonts w:asciiTheme="majorHAnsi" w:hAnsiTheme="majorHAnsi" w:cs="Times New Roman"/>
-              </w:rPr>
-            </w:pPr>
-            <w:r>
-              <w:rPr>
-                <w:rFonts w:asciiTheme="majorHAnsi" w:hAnsiTheme="majorHAnsi" w:cs="Times New Roman"/>
                 <w:sz w:val="20"/>
                 <w:szCs w:val="20"/>
               </w:rPr>
-              <w:t>………………………………………. podpis uczelnianego opiekuna praktyki</w:t>
+            </w:pPr>
+            <w:r>
+              <w:rPr>
+                <w:rFonts w:asciiTheme="majorHAnsi" w:hAnsiTheme="majorHAnsi" w:cs="Times New Roman"/>
+                <w:sz w:val="20"/>
+                <w:szCs w:val="20"/>
+              </w:rPr>
+              <w:t>{{ opiekun_uczelniany_full_name }}</w:t>
+            </w:r>
+            <w:r>
+              <w:rPr>
+                <w:rFonts w:asciiTheme="majorHAnsi" w:hAnsiTheme="majorHAnsi" w:cs="Times New Roman"/>
+                <w:sz w:val="20"/>
+                <w:szCs w:val="20"/>
+              </w:rPr>
+              <w:t xml:space="preserve">                         </w:t>
+            </w:r>
+            <w:r>
+              <w:rPr>
+                <w:rFonts w:asciiTheme="majorHAnsi" w:hAnsiTheme="majorHAnsi" w:cs="Times New Roman"/>
+                <w:sz w:val="20"/>
+                <w:szCs w:val="20"/>
+              </w:rPr>
+              <w:t xml:space="preserve"> podpis uczelnianego opiekuna praktyki</w:t>
             </w:r>
           </w:p>
         </w:tc>
@@ -2608,7 +3810,23 @@
                 <w:sz w:val="20"/>
                 <w:szCs w:val="20"/>
               </w:rPr>
-              <w:t>………………………………………. podpis zakładowego opiekuna praktyki</w:t>
+              <w:t>{{ opiekun_firmowy_full_name }}</w:t>
+            </w:r>
+            <w:r>
+              <w:rPr>
+                <w:rFonts w:asciiTheme="majorHAnsi" w:hAnsiTheme="majorHAnsi" w:cs="Times New Roman"/>
+                <w:sz w:val="20"/>
+                <w:szCs w:val="20"/>
+              </w:rPr>
+              <w:t xml:space="preserve">                  </w:t>
+            </w:r>
+            <w:r>
+              <w:rPr>
+                <w:rFonts w:asciiTheme="majorHAnsi" w:hAnsiTheme="majorHAnsi" w:cs="Times New Roman"/>
+                <w:sz w:val="20"/>
+                <w:szCs w:val="20"/>
+              </w:rPr>
+              <w:t xml:space="preserve"> podpis zakładowego opiekuna praktyki</w:t>
             </w:r>
           </w:p>
           <w:p>
@@ -2641,7 +3859,7 @@
                 <w:sz w:val="20"/>
                 <w:szCs w:val="20"/>
               </w:rPr>
-              <w:t>………………………………………..</w:t>
+              <w:t>{{ student.imie }} {{ student.nazwisko }}</w:t>
             </w:r>
           </w:p>
           <w:p>
@@ -2687,6 +3905,7 @@
           <w:sz w:val="20"/>
           <w:szCs w:val="20"/>
         </w:rPr>
+        <w:lastRenderedPageBreak/>
         <w:t xml:space="preserve"> </w:t>
       </w:r>
     </w:p>
@@ -2703,7 +3922,7 @@
 </file>
 
 <file path=word/endnotes.xml><?xml version="1.0" encoding="utf-8"?>
-<w:endnotes xmlns:wpc="http://schemas.microsoft.com/office/word/2010/wordprocessingCanvas" xmlns:cx="http://schemas.microsoft.com/office/drawing/2014/chartex" xmlns:cx1="http://schemas.microsoft.com/office/drawing/2015/9/8/chartex" xmlns:cx2="http://schemas.microsoft.com/office/drawing/2015/10/21/chartex" xmlns:cx3="http://schemas.microsoft.com/office/drawing/2016/5/9/chartex" xmlns:cx4="http://schemas.microsoft.com/office/drawing/2016/5/10/chartex" xmlns:cx5="http://schemas.microsoft.com/office/drawing/2016/5/11/chartex" xmlns:cx6="http://schemas.microsoft.com/office/drawing/2016/5/12/chartex" xmlns:cx7="http://schemas.microsoft.com/office/drawing/2016/5/13/chartex" xmlns:cx8="http://schemas.microsoft.com/office/drawing/2016/5/14/chartex" xmlns:mc="http://schemas.openxmlformats.org/markup-compatibility/2006" xmlns:aink="http://schemas.microsoft.com/office/drawing/2016/ink" xmlns:am3d="http://schemas.microsoft.com/office/drawing/2017/model3d" xmlns:o="urn:schemas-microsoft-com:office:office" xmlns:oel="http://schemas.microsoft.com/office/2019/extlst" xmlns:r="http://schemas.openxmlformats.org/officeDocument/2006/relationships" xmlns:m="http://schemas.openxmlformats.org/officeDocument/2006/math" xmlns:v="urn:schemas-microsoft-com:vml" xmlns:wp14="http://schemas.microsoft.com/office/word/2010/wordprocessingDrawing" xmlns:wp="http://schemas.openxmlformats.org/drawingml/2006/wordprocessingDrawing" xmlns:w10="urn:schemas-microsoft-com:office:word" xmlns:w="http://schemas.openxmlformats.org/wordprocessingml/2006/main" xmlns:w14="http://schemas.microsoft.com/office/word/2010/wordml" xmlns:w15="http://schemas.microsoft.com/office/word/2012/wordml" xmlns:w16cex="http://schemas.microsoft.com/office/word/2018/wordml/cex" xmlns:w16cid="http://schemas.microsoft.com/office/word/2016/wordml/cid" xmlns:w16="http://schemas.microsoft.com/office/word/2018/wordml" xmlns:w16du="http://schemas.microsoft.com/office/word/2023/wordml/word16du" xmlns:w16sdtdh="http://schemas.microsoft.com/office/word/2020/wordml/sdtdatahash" xmlns:w16se="http://schemas.microsoft.com/office/word/2015/wordml/symex" xmlns:wpg="http://schemas.microsoft.com/office/word/2010/wordprocessingGroup" xmlns:wpi="http://schemas.microsoft.com/office/word/2010/wordprocessingInk" xmlns:wne="http://schemas.microsoft.com/office/word/2006/wordml" xmlns:wps="http://schemas.microsoft.com/office/word/2010/wordprocessingShape" mc:Ignorable="w14 w15 w16se w16cid w16 w16cex w16sdtdh w16du wp14">
+<w:endnotes xmlns:wpc="http://schemas.microsoft.com/office/word/2010/wordprocessingCanvas" xmlns:cx="http://schemas.microsoft.com/office/drawing/2014/chartex" xmlns:cx1="http://schemas.microsoft.com/office/drawing/2015/9/8/chartex" xmlns:cx2="http://schemas.microsoft.com/office/drawing/2015/10/21/chartex" xmlns:cx3="http://schemas.microsoft.com/office/drawing/2016/5/9/chartex" xmlns:cx4="http://schemas.microsoft.com/office/drawing/2016/5/10/chartex" xmlns:cx5="http://schemas.microsoft.com/office/drawing/2016/5/11/chartex" xmlns:cx6="http://schemas.microsoft.com/office/drawing/2016/5/12/chartex" xmlns:cx7="http://schemas.microsoft.com/office/drawing/2016/5/13/chartex" xmlns:cx8="http://schemas.microsoft.com/office/drawing/2016/5/14/chartex" xmlns:mc="http://schemas.openxmlformats.org/markup-compatibility/2006" xmlns:aink="http://schemas.microsoft.com/office/drawing/2016/ink" xmlns:am3d="http://schemas.microsoft.com/office/drawing/2017/model3d" xmlns:o="urn:schemas-microsoft-com:office:office" xmlns:oel="http://schemas.microsoft.com/office/2019/extlst" xmlns:r="http://schemas.openxmlformats.org/officeDocument/2006/relationships" xmlns:m="http://schemas.openxmlformats.org/officeDocument/2006/math" xmlns:v="urn:schemas-microsoft-com:vml" xmlns:wp14="http://schemas.microsoft.com/office/word/2010/wordprocessingDrawing" xmlns:wp="http://schemas.openxmlformats.org/drawingml/2006/wordprocessingDrawing" xmlns:w10="urn:schemas-microsoft-com:office:word" xmlns:w="http://schemas.openxmlformats.org/wordprocessingml/2006/main" xmlns:w14="http://schemas.microsoft.com/office/word/2010/wordml" xmlns:w15="http://schemas.microsoft.com/office/word/2012/wordml" xmlns:w16cex="http://schemas.microsoft.com/office/word/2018/wordml/cex" xmlns:w16cid="http://schemas.microsoft.com/office/word/2016/wordml/cid" xmlns:w16="http://schemas.microsoft.com/office/word/2018/wordml" xmlns:w16du="http://schemas.microsoft.com/office/word/2023/wordml/word16du" xmlns:w16sdtdh="http://schemas.microsoft.com/office/word/2020/wordml/sdtdatahash" xmlns:w16sdtfl="http://schemas.microsoft.com/office/word/2024/wordml/sdtformatlock" xmlns:w16se="http://schemas.microsoft.com/office/word/2015/wordml/symex" xmlns:wpg="http://schemas.microsoft.com/office/word/2010/wordprocessingGroup" xmlns:wpi="http://schemas.microsoft.com/office/word/2010/wordprocessingInk" xmlns:wne="http://schemas.microsoft.com/office/word/2006/wordml" xmlns:wps="http://schemas.microsoft.com/office/word/2010/wordprocessingShape" mc:Ignorable="w14 w15 w16se w16cid w16 w16cex w16sdtdh w16sdtfl w16du wp14">
   <w:endnote w:type="separator" w:id="-1">
     <w:p>
       <w:pPr>
@@ -2728,7 +3947,7 @@
 </file>
 
 <file path=word/footer1.xml><?xml version="1.0" encoding="utf-8"?>
-<w:ftr xmlns:wpc="http://schemas.microsoft.com/office/word/2010/wordprocessingCanvas" xmlns:cx="http://schemas.microsoft.com/office/drawing/2014/chartex" xmlns:cx1="http://schemas.microsoft.com/office/drawing/2015/9/8/chartex" xmlns:cx2="http://schemas.microsoft.com/office/drawing/2015/10/21/chartex" xmlns:cx3="http://schemas.microsoft.com/office/drawing/2016/5/9/chartex" xmlns:cx4="http://schemas.microsoft.com/office/drawing/2016/5/10/chartex" xmlns:cx5="http://schemas.microsoft.com/office/drawing/2016/5/11/chartex" xmlns:cx6="http://schemas.microsoft.com/office/drawing/2016/5/12/chartex" xmlns:cx7="http://schemas.microsoft.com/office/drawing/2016/5/13/chartex" xmlns:cx8="http://schemas.microsoft.com/office/drawing/2016/5/14/chartex" xmlns:mc="http://schemas.openxmlformats.org/markup-compatibility/2006" xmlns:aink="http://schemas.microsoft.com/office/drawing/2016/ink" xmlns:am3d="http://schemas.microsoft.com/office/drawing/2017/model3d" xmlns:o="urn:schemas-microsoft-com:office:office" xmlns:oel="http://schemas.microsoft.com/office/2019/extlst" xmlns:r="http://schemas.openxmlformats.org/officeDocument/2006/relationships" xmlns:m="http://schemas.openxmlformats.org/officeDocument/2006/math" xmlns:v="urn:schemas-microsoft-com:vml" xmlns:wp14="http://schemas.microsoft.com/office/word/2010/wordprocessingDrawing" xmlns:wp="http://schemas.openxmlformats.org/drawingml/2006/wordprocessingDrawing" xmlns:w10="urn:schemas-microsoft-com:office:word" xmlns:w="http://schemas.openxmlformats.org/wordprocessingml/2006/main" xmlns:w14="http://schemas.microsoft.com/office/word/2010/wordml" xmlns:w15="http://schemas.microsoft.com/office/word/2012/wordml" xmlns:w16cex="http://schemas.microsoft.com/office/word/2018/wordml/cex" xmlns:w16cid="http://schemas.microsoft.com/office/word/2016/wordml/cid" xmlns:w16="http://schemas.microsoft.com/office/word/2018/wordml" xmlns:w16du="http://schemas.microsoft.com/office/word/2023/wordml/word16du" xmlns:w16sdtdh="http://schemas.microsoft.com/office/word/2020/wordml/sdtdatahash" xmlns:w16se="http://schemas.microsoft.com/office/word/2015/wordml/symex" xmlns:wpg="http://schemas.microsoft.com/office/word/2010/wordprocessingGroup" xmlns:wpi="http://schemas.microsoft.com/office/word/2010/wordprocessingInk" xmlns:wne="http://schemas.microsoft.com/office/word/2006/wordml" xmlns:wps="http://schemas.microsoft.com/office/word/2010/wordprocessingShape" mc:Ignorable="w14 w15 w16se w16cid w16 w16cex w16sdtdh w16du wp14">
+<w:ftr xmlns:wpc="http://schemas.microsoft.com/office/word/2010/wordprocessingCanvas" xmlns:cx="http://schemas.microsoft.com/office/drawing/2014/chartex" xmlns:cx1="http://schemas.microsoft.com/office/drawing/2015/9/8/chartex" xmlns:cx2="http://schemas.microsoft.com/office/drawing/2015/10/21/chartex" xmlns:cx3="http://schemas.microsoft.com/office/drawing/2016/5/9/chartex" xmlns:cx4="http://schemas.microsoft.com/office/drawing/2016/5/10/chartex" xmlns:cx5="http://schemas.microsoft.com/office/drawing/2016/5/11/chartex" xmlns:cx6="http://schemas.microsoft.com/office/drawing/2016/5/12/chartex" xmlns:cx7="http://schemas.microsoft.com/office/drawing/2016/5/13/chartex" xmlns:cx8="http://schemas.microsoft.com/office/drawing/2016/5/14/chartex" xmlns:mc="http://schemas.openxmlformats.org/markup-compatibility/2006" xmlns:aink="http://schemas.microsoft.com/office/drawing/2016/ink" xmlns:am3d="http://schemas.microsoft.com/office/drawing/2017/model3d" xmlns:o="urn:schemas-microsoft-com:office:office" xmlns:oel="http://schemas.microsoft.com/office/2019/extlst" xmlns:r="http://schemas.openxmlformats.org/officeDocument/2006/relationships" xmlns:m="http://schemas.openxmlformats.org/officeDocument/2006/math" xmlns:v="urn:schemas-microsoft-com:vml" xmlns:wp14="http://schemas.microsoft.com/office/word/2010/wordprocessingDrawing" xmlns:wp="http://schemas.openxmlformats.org/drawingml/2006/wordprocessingDrawing" xmlns:w10="urn:schemas-microsoft-com:office:word" xmlns:w="http://schemas.openxmlformats.org/wordprocessingml/2006/main" xmlns:w14="http://schemas.microsoft.com/office/word/2010/wordml" xmlns:w15="http://schemas.microsoft.com/office/word/2012/wordml" xmlns:w16cex="http://schemas.microsoft.com/office/word/2018/wordml/cex" xmlns:w16cid="http://schemas.microsoft.com/office/word/2016/wordml/cid" xmlns:w16="http://schemas.microsoft.com/office/word/2018/wordml" xmlns:w16du="http://schemas.microsoft.com/office/word/2023/wordml/word16du" xmlns:w16sdtdh="http://schemas.microsoft.com/office/word/2020/wordml/sdtdatahash" xmlns:w16sdtfl="http://schemas.microsoft.com/office/word/2024/wordml/sdtformatlock" xmlns:w16se="http://schemas.microsoft.com/office/word/2015/wordml/symex" xmlns:wpg="http://schemas.microsoft.com/office/word/2010/wordprocessingGroup" xmlns:wpi="http://schemas.microsoft.com/office/word/2010/wordprocessingInk" xmlns:wne="http://schemas.microsoft.com/office/word/2006/wordml" xmlns:wps="http://schemas.microsoft.com/office/word/2010/wordprocessingShape" mc:Ignorable="w14 w15 w16se w16cid w16 w16cex w16sdtdh w16sdtfl w16du wp14">
   <w:p>
     <w:pPr>
       <w:jc w:val="center"/>
@@ -2754,7 +3973,6 @@
           <w:docPartUnique/>
         </w:docPartObj>
       </w:sdtPr>
-      <w:sdtEndPr/>
       <w:sdtContent>
         <w:r>
           <w:rPr>
@@ -2853,7 +4071,7 @@
 </file>
 
 <file path=word/footnotes.xml><?xml version="1.0" encoding="utf-8"?>
-<w:footnotes xmlns:wpc="http://schemas.microsoft.com/office/word/2010/wordprocessingCanvas" xmlns:cx="http://schemas.microsoft.com/office/drawing/2014/chartex" xmlns:cx1="http://schemas.microsoft.com/office/drawing/2015/9/8/chartex" xmlns:cx2="http://schemas.microsoft.com/office/drawing/2015/10/21/chartex" xmlns:cx3="http://schemas.microsoft.com/office/drawing/2016/5/9/chartex" xmlns:cx4="http://schemas.microsoft.com/office/drawing/2016/5/10/chartex" xmlns:cx5="http://schemas.microsoft.com/office/drawing/2016/5/11/chartex" xmlns:cx6="http://schemas.microsoft.com/office/drawing/2016/5/12/chartex" xmlns:cx7="http://schemas.microsoft.com/office/drawing/2016/5/13/chartex" xmlns:cx8="http://schemas.microsoft.com/office/drawing/2016/5/14/chartex" xmlns:mc="http://schemas.openxmlformats.org/markup-compatibility/2006" xmlns:aink="http://schemas.microsoft.com/office/drawing/2016/ink" xmlns:am3d="http://schemas.microsoft.com/office/drawing/2017/model3d" xmlns:o="urn:schemas-microsoft-com:office:office" xmlns:oel="http://schemas.microsoft.com/office/2019/extlst" xmlns:r="http://schemas.openxmlformats.org/officeDocument/2006/relationships" xmlns:m="http://schemas.openxmlformats.org/officeDocument/2006/math" xmlns:v="urn:schemas-microsoft-com:vml" xmlns:wp14="http://schemas.microsoft.com/office/word/2010/wordprocessingDrawing" xmlns:wp="http://schemas.openxmlformats.org/drawingml/2006/wordprocessingDrawing" xmlns:w10="urn:schemas-microsoft-com:office:word" xmlns:w="http://schemas.openxmlformats.org/wordprocessingml/2006/main" xmlns:w14="http://schemas.microsoft.com/office/word/2010/wordml" xmlns:w15="http://schemas.microsoft.com/office/word/2012/wordml" xmlns:w16cex="http://schemas.microsoft.com/office/word/2018/wordml/cex" xmlns:w16cid="http://schemas.microsoft.com/office/word/2016/wordml/cid" xmlns:w16="http://schemas.microsoft.com/office/word/2018/wordml" xmlns:w16du="http://schemas.microsoft.com/office/word/2023/wordml/word16du" xmlns:w16sdtdh="http://schemas.microsoft.com/office/word/2020/wordml/sdtdatahash" xmlns:w16se="http://schemas.microsoft.com/office/word/2015/wordml/symex" xmlns:wpg="http://schemas.microsoft.com/office/word/2010/wordprocessingGroup" xmlns:wpi="http://schemas.microsoft.com/office/word/2010/wordprocessingInk" xmlns:wne="http://schemas.microsoft.com/office/word/2006/wordml" xmlns:wps="http://schemas.microsoft.com/office/word/2010/wordprocessingShape" mc:Ignorable="w14 w15 w16se w16cid w16 w16cex w16sdtdh w16du wp14">
+<w:footnotes xmlns:wpc="http://schemas.microsoft.com/office/word/2010/wordprocessingCanvas" xmlns:cx="http://schemas.microsoft.com/office/drawing/2014/chartex" xmlns:cx1="http://schemas.microsoft.com/office/drawing/2015/9/8/chartex" xmlns:cx2="http://schemas.microsoft.com/office/drawing/2015/10/21/chartex" xmlns:cx3="http://schemas.microsoft.com/office/drawing/2016/5/9/chartex" xmlns:cx4="http://schemas.microsoft.com/office/drawing/2016/5/10/chartex" xmlns:cx5="http://schemas.microsoft.com/office/drawing/2016/5/11/chartex" xmlns:cx6="http://schemas.microsoft.com/office/drawing/2016/5/12/chartex" xmlns:cx7="http://schemas.microsoft.com/office/drawing/2016/5/13/chartex" xmlns:cx8="http://schemas.microsoft.com/office/drawing/2016/5/14/chartex" xmlns:mc="http://schemas.openxmlformats.org/markup-compatibility/2006" xmlns:aink="http://schemas.microsoft.com/office/drawing/2016/ink" xmlns:am3d="http://schemas.microsoft.com/office/drawing/2017/model3d" xmlns:o="urn:schemas-microsoft-com:office:office" xmlns:oel="http://schemas.microsoft.com/office/2019/extlst" xmlns:r="http://schemas.openxmlformats.org/officeDocument/2006/relationships" xmlns:m="http://schemas.openxmlformats.org/officeDocument/2006/math" xmlns:v="urn:schemas-microsoft-com:vml" xmlns:wp14="http://schemas.microsoft.com/office/word/2010/wordprocessingDrawing" xmlns:wp="http://schemas.openxmlformats.org/drawingml/2006/wordprocessingDrawing" xmlns:w10="urn:schemas-microsoft-com:office:word" xmlns:w="http://schemas.openxmlformats.org/wordprocessingml/2006/main" xmlns:w14="http://schemas.microsoft.com/office/word/2010/wordml" xmlns:w15="http://schemas.microsoft.com/office/word/2012/wordml" xmlns:w16cex="http://schemas.microsoft.com/office/word/2018/wordml/cex" xmlns:w16cid="http://schemas.microsoft.com/office/word/2016/wordml/cid" xmlns:w16="http://schemas.microsoft.com/office/word/2018/wordml" xmlns:w16du="http://schemas.microsoft.com/office/word/2023/wordml/word16du" xmlns:w16sdtdh="http://schemas.microsoft.com/office/word/2020/wordml/sdtdatahash" xmlns:w16sdtfl="http://schemas.microsoft.com/office/word/2024/wordml/sdtformatlock" xmlns:w16se="http://schemas.microsoft.com/office/word/2015/wordml/symex" xmlns:wpg="http://schemas.microsoft.com/office/word/2010/wordprocessingGroup" xmlns:wpi="http://schemas.microsoft.com/office/word/2010/wordprocessingInk" xmlns:wne="http://schemas.microsoft.com/office/word/2006/wordml" xmlns:wps="http://schemas.microsoft.com/office/word/2010/wordprocessingShape" mc:Ignorable="w14 w15 w16se w16cid w16 w16cex w16sdtdh w16sdtfl w16du wp14">
   <w:footnote w:type="separator" w:id="-1">
     <w:p>
       <w:pPr>
@@ -2878,7 +4096,7 @@
 </file>
 
 <file path=word/header1.xml><?xml version="1.0" encoding="utf-8"?>
-<w:hdr xmlns:wpc="http://schemas.microsoft.com/office/word/2010/wordprocessingCanvas" xmlns:cx="http://schemas.microsoft.com/office/drawing/2014/chartex" xmlns:cx1="http://schemas.microsoft.com/office/drawing/2015/9/8/chartex" xmlns:cx2="http://schemas.microsoft.com/office/drawing/2015/10/21/chartex" xmlns:cx3="http://schemas.microsoft.com/office/drawing/2016/5/9/chartex" xmlns:cx4="http://schemas.microsoft.com/office/drawing/2016/5/10/chartex" xmlns:cx5="http://schemas.microsoft.com/office/drawing/2016/5/11/chartex" xmlns:cx6="http://schemas.microsoft.com/office/drawing/2016/5/12/chartex" xmlns:cx7="http://schemas.microsoft.com/office/drawing/2016/5/13/chartex" xmlns:cx8="http://schemas.microsoft.com/office/drawing/2016/5/14/chartex" xmlns:mc="http://schemas.openxmlformats.org/markup-compatibility/2006" xmlns:aink="http://schemas.microsoft.com/office/drawing/2016/ink" xmlns:am3d="http://schemas.microsoft.com/office/drawing/2017/model3d" xmlns:o="urn:schemas-microsoft-com:office:office" xmlns:oel="http://schemas.microsoft.com/office/2019/extlst" xmlns:r="http://schemas.openxmlformats.org/officeDocument/2006/relationships" xmlns:m="http://schemas.openxmlformats.org/officeDocument/2006/math" xmlns:v="urn:schemas-microsoft-com:vml" xmlns:wp14="http://schemas.microsoft.com/office/word/2010/wordprocessingDrawing" xmlns:wp="http://schemas.openxmlformats.org/drawingml/2006/wordprocessingDrawing" xmlns:w10="urn:schemas-microsoft-com:office:word" xmlns:w="http://schemas.openxmlformats.org/wordprocessingml/2006/main" xmlns:w14="http://schemas.microsoft.com/office/word/2010/wordml" xmlns:w15="http://schemas.microsoft.com/office/word/2012/wordml" xmlns:w16cex="http://schemas.microsoft.com/office/word/2018/wordml/cex" xmlns:w16cid="http://schemas.microsoft.com/office/word/2016/wordml/cid" xmlns:w16="http://schemas.microsoft.com/office/word/2018/wordml" xmlns:w16du="http://schemas.microsoft.com/office/word/2023/wordml/word16du" xmlns:w16sdtdh="http://schemas.microsoft.com/office/word/2020/wordml/sdtdatahash" xmlns:w16se="http://schemas.microsoft.com/office/word/2015/wordml/symex" xmlns:wpg="http://schemas.microsoft.com/office/word/2010/wordprocessingGroup" xmlns:wpi="http://schemas.microsoft.com/office/word/2010/wordprocessingInk" xmlns:wne="http://schemas.microsoft.com/office/word/2006/wordml" xmlns:wps="http://schemas.microsoft.com/office/word/2010/wordprocessingShape" mc:Ignorable="w14 w15 w16se w16cid w16 w16cex w16sdtdh w16du wp14">
+<w:hdr xmlns:wpc="http://schemas.microsoft.com/office/word/2010/wordprocessingCanvas" xmlns:cx="http://schemas.microsoft.com/office/drawing/2014/chartex" xmlns:cx1="http://schemas.microsoft.com/office/drawing/2015/9/8/chartex" xmlns:cx2="http://schemas.microsoft.com/office/drawing/2015/10/21/chartex" xmlns:cx3="http://schemas.microsoft.com/office/drawing/2016/5/9/chartex" xmlns:cx4="http://schemas.microsoft.com/office/drawing/2016/5/10/chartex" xmlns:cx5="http://schemas.microsoft.com/office/drawing/2016/5/11/chartex" xmlns:cx6="http://schemas.microsoft.com/office/drawing/2016/5/12/chartex" xmlns:cx7="http://schemas.microsoft.com/office/drawing/2016/5/13/chartex" xmlns:cx8="http://schemas.microsoft.com/office/drawing/2016/5/14/chartex" xmlns:mc="http://schemas.openxmlformats.org/markup-compatibility/2006" xmlns:aink="http://schemas.microsoft.com/office/drawing/2016/ink" xmlns:am3d="http://schemas.microsoft.com/office/drawing/2017/model3d" xmlns:o="urn:schemas-microsoft-com:office:office" xmlns:oel="http://schemas.microsoft.com/office/2019/extlst" xmlns:r="http://schemas.openxmlformats.org/officeDocument/2006/relationships" xmlns:m="http://schemas.openxmlformats.org/officeDocument/2006/math" xmlns:v="urn:schemas-microsoft-com:vml" xmlns:wp14="http://schemas.microsoft.com/office/word/2010/wordprocessingDrawing" xmlns:wp="http://schemas.openxmlformats.org/drawingml/2006/wordprocessingDrawing" xmlns:w10="urn:schemas-microsoft-com:office:word" xmlns:w="http://schemas.openxmlformats.org/wordprocessingml/2006/main" xmlns:w14="http://schemas.microsoft.com/office/word/2010/wordml" xmlns:w15="http://schemas.microsoft.com/office/word/2012/wordml" xmlns:w16cex="http://schemas.microsoft.com/office/word/2018/wordml/cex" xmlns:w16cid="http://schemas.microsoft.com/office/word/2016/wordml/cid" xmlns:w16="http://schemas.microsoft.com/office/word/2018/wordml" xmlns:w16du="http://schemas.microsoft.com/office/word/2023/wordml/word16du" xmlns:w16sdtdh="http://schemas.microsoft.com/office/word/2020/wordml/sdtdatahash" xmlns:w16sdtfl="http://schemas.microsoft.com/office/word/2024/wordml/sdtformatlock" xmlns:w16se="http://schemas.microsoft.com/office/word/2015/wordml/symex" xmlns:wpg="http://schemas.microsoft.com/office/word/2010/wordprocessingGroup" xmlns:wpi="http://schemas.microsoft.com/office/word/2010/wordprocessingInk" xmlns:wne="http://schemas.microsoft.com/office/word/2006/wordml" xmlns:wps="http://schemas.microsoft.com/office/word/2010/wordprocessingShape" mc:Ignorable="w14 w15 w16se w16cid w16 w16cex w16sdtdh w16sdtfl w16du wp14">
   <w:p>
     <w:pPr>
       <w:pStyle w:val="Nagwek"/>
@@ -2908,7 +4126,7 @@
 </file>
 
 <file path=word/styles.xml><?xml version="1.0" encoding="utf-8"?>
-<w:styles xmlns:mc="http://schemas.openxmlformats.org/markup-compatibility/2006" xmlns:r="http://schemas.openxmlformats.org/officeDocument/2006/relationships" xmlns:w="http://schemas.openxmlformats.org/wordprocessingml/2006/main" xmlns:w14="http://schemas.microsoft.com/office/word/2010/wordml" xmlns:w15="http://schemas.microsoft.com/office/word/2012/wordml" xmlns:w16cex="http://schemas.microsoft.com/office/word/2018/wordml/cex" xmlns:w16cid="http://schemas.microsoft.com/office/word/2016/wordml/cid" xmlns:w16="http://schemas.microsoft.com/office/word/2018/wordml" xmlns:w16du="http://schemas.microsoft.com/office/word/2023/wordml/word16du" xmlns:w16sdtdh="http://schemas.microsoft.com/office/word/2020/wordml/sdtdatahash" xmlns:w16se="http://schemas.microsoft.com/office/word/2015/wordml/symex" mc:Ignorable="w14 w15 w16se w16cid w16 w16cex w16sdtdh w16du">
+<w:styles xmlns:mc="http://schemas.openxmlformats.org/markup-compatibility/2006" xmlns:r="http://schemas.openxmlformats.org/officeDocument/2006/relationships" xmlns:w="http://schemas.openxmlformats.org/wordprocessingml/2006/main" xmlns:w14="http://schemas.microsoft.com/office/word/2010/wordml" xmlns:w15="http://schemas.microsoft.com/office/word/2012/wordml" xmlns:w16cex="http://schemas.microsoft.com/office/word/2018/wordml/cex" xmlns:w16cid="http://schemas.microsoft.com/office/word/2016/wordml/cid" xmlns:w16="http://schemas.microsoft.com/office/word/2018/wordml" xmlns:w16du="http://schemas.microsoft.com/office/word/2023/wordml/word16du" xmlns:w16sdtdh="http://schemas.microsoft.com/office/word/2020/wordml/sdtdatahash" xmlns:w16sdtfl="http://schemas.microsoft.com/office/word/2024/wordml/sdtformatlock" xmlns:w16se="http://schemas.microsoft.com/office/word/2015/wordml/symex" mc:Ignorable="w14 w15 w16se w16cid w16 w16cex w16sdtdh w16sdtfl w16du">
   <w:docDefaults>
     <w:rPrDefault>
       <w:rPr>
@@ -3329,7 +4547,6 @@
   <w:style w:type="character" w:default="1" w:styleId="Domylnaczcionkaakapitu">
     <w:name w:val="Default Paragraph Font"/>
     <w:uiPriority w:val="1"/>
-    <w:semiHidden/>
     <w:unhideWhenUsed/>
   </w:style>
   <w:style w:type="table" w:default="1" w:styleId="Standardowy">

</xml_diff>